<commit_message>
Complete final project documentation, notebook, and pipeline updates
</commit_message>
<xml_diff>
--- a/reports/FINAL_PROJECT_DOCUMENTATION.docx
+++ b/reports/FINAL_PROJECT_DOCUMENTATION.docx
@@ -44,6 +44,10 @@
         <w:t>Dataset: Seoul Bike Sharing Demand Dataset (UCI ML Repository)</w:t>
         <w:br/>
         <w:t>Deliverables: Python Code Pipeline, Reproducible Jupyter Notebook, &amp; Project Report</w:t>
+        <w:br/>
+        <w:t>Section: C2B | Instructor: Ms. Donna Garcia | Date of Submission: Friday (October 30, 2026)</w:t>
+        <w:br/>
+        <w:t>Group Name: FML | Members: Fabello, Courtney Judge; Lubi, Axellerosh; Macaraig, Paolo Adrian</w:t>
       </w:r>
     </w:p>
     <w:p>
@@ -80,6 +84,81 @@
         <w:spacing w:after="80" w:line="276" w:lineRule="auto"/>
       </w:pPr>
       <w:r>
+        <w:t>Course: Introduction to Data Science (Intdsci)</w:t>
+      </w:r>
+    </w:p>
+    <w:p>
+      <w:pPr>
+        <w:spacing w:after="80" w:line="276" w:lineRule="auto"/>
+      </w:pPr>
+      <w:r>
+        <w:t>Section: C2B</w:t>
+      </w:r>
+    </w:p>
+    <w:p>
+      <w:pPr>
+        <w:spacing w:after="80" w:line="276" w:lineRule="auto"/>
+      </w:pPr>
+      <w:r>
+        <w:t>Instructor: Ms. Donna Garcia</w:t>
+      </w:r>
+    </w:p>
+    <w:p>
+      <w:pPr>
+        <w:spacing w:after="80" w:line="276" w:lineRule="auto"/>
+      </w:pPr>
+      <w:r>
+        <w:t>Group Name: FML</w:t>
+      </w:r>
+    </w:p>
+    <w:p>
+      <w:pPr>
+        <w:spacing w:after="80" w:line="276" w:lineRule="auto"/>
+      </w:pPr>
+      <w:r>
+        <w:t>Group Members:</w:t>
+      </w:r>
+    </w:p>
+    <w:p>
+      <w:pPr>
+        <w:pStyle w:val="ListBullet"/>
+        <w:spacing w:after="40"/>
+      </w:pPr>
+      <w:r>
+        <w:t>Fabello, Courtney Judge</w:t>
+      </w:r>
+    </w:p>
+    <w:p>
+      <w:pPr>
+        <w:pStyle w:val="ListBullet"/>
+        <w:spacing w:after="40"/>
+      </w:pPr>
+      <w:r>
+        <w:t>Lubi, Axellerosh</w:t>
+      </w:r>
+    </w:p>
+    <w:p>
+      <w:pPr>
+        <w:pStyle w:val="ListBullet"/>
+        <w:spacing w:after="40"/>
+      </w:pPr>
+      <w:r>
+        <w:t>Macaraig, Paolo Adrian</w:t>
+      </w:r>
+    </w:p>
+    <w:p>
+      <w:pPr>
+        <w:spacing w:after="80" w:line="276" w:lineRule="auto"/>
+      </w:pPr>
+      <w:r>
+        <w:t>Date of Submission: Friday (October 30, 2026)</w:t>
+      </w:r>
+    </w:p>
+    <w:p>
+      <w:pPr>
+        <w:spacing w:after="80" w:line="276" w:lineRule="auto"/>
+      </w:pPr>
+      <w:r>
         <w:t>Project Title: Supervised Binary Classification of Hourly Bike Rental Demand in Seoul Using Ambient Meteorological and Calendar Features</w:t>
       </w:r>
     </w:p>
@@ -88,7 +167,7 @@
         <w:spacing w:after="80" w:line="276" w:lineRule="auto"/>
       </w:pPr>
       <w:r>
-        <w:t>Dataset: Seoul Bike Sharing Demand Dataset (UCI Machine Learning Repository)</w:t>
+        <w:t>Dataset: Seoul Bike Sharing Demand Dataset (UCI Machine Learning Repository &amp; Class Google Drive)</w:t>
       </w:r>
     </w:p>
     <w:p>
@@ -96,7 +175,7 @@
         <w:spacing w:after="80" w:line="276" w:lineRule="auto"/>
       </w:pPr>
       <w:r>
-        <w:t>Deliverables: Executable Python Pipeline (`run_pipeline.py`), Reproducible Jupyter Notebook (`notebooks/final_project.ipynb`), and Detailed Report (`reports/FINAL_PROJECT_DOCUMENTATION.md`)</w:t>
+        <w:t>Deliverables: Executable Python Pipeline (`run_pipeline.py`), Reproducible Jupyter Notebook (`notebooks/final_project.ipynb`), and Formatted Project Report (`reports/FINAL_PROJECT_DOCUMENTATION.md` / `.docx`)</w:t>
       </w:r>
     </w:p>
     <w:p>
@@ -253,7 +332,7 @@
         <w:spacing w:after="80" w:line="276" w:lineRule="auto"/>
       </w:pPr>
       <w:r>
-        <w:t>0 &amp; \text{if } \text{Rented Bike Count}_t = 0 \quad (\text{No bikes rented}) \\</w:t>
+        <w:t>0 &amp; \text{if } \text{Rented Bike Count}_t = 0 \quad (\text{No bikes rented / Zero demand}) \\</w:t>
       </w:r>
     </w:p>
     <w:p>
@@ -261,7 +340,7 @@
         <w:spacing w:after="80" w:line="276" w:lineRule="auto"/>
       </w:pPr>
       <w:r>
-        <w:t>1 &amp; \text{if } \text{Rented Bike Count}_t &gt; 0 \quad (\text{At least one bike rented})</w:t>
+        <w:t>1 &amp; \text{if } \text{Rented Bike Count}_t &gt; 0 \quad (\text{At least one bike rented / Active demand})</w:t>
       </w:r>
     </w:p>
     <w:p>
@@ -304,7 +383,7 @@
         <w:spacing w:after="40"/>
       </w:pPr>
       <w:r>
-        <w:t>At least four labelled exploratory data analysis (EDA) charts revealing diurnal, seasonal, and meteorological dynamics.</w:t>
+        <w:t>Four labelled exploratory data analysis (EDA) charts revealing diurnal, seasonal, and meteorological dynamics.</w:t>
       </w:r>
     </w:p>
     <w:p>
@@ -313,7 +392,7 @@
         <w:spacing w:after="40"/>
       </w:pPr>
       <w:r>
-        <w:t>A reproducible 80–20 train-test partition locked with seed `random_state=42`.</w:t>
+        <w:t>A reproducible 80–20 train-test partition locked with seed `random_state=42` and preserved class stratification.</w:t>
       </w:r>
     </w:p>
     <w:p>
@@ -336,11 +415,11 @@
     </w:p>
     <w:p>
       <w:pPr>
-        <w:pStyle w:val="Heading3"/>
-        <w:spacing w:before="160" w:after="60"/>
+        <w:pStyle w:val="ListNumber"/>
+        <w:spacing w:after="40"/>
       </w:pPr>
       <w:r>
-        <w:t>A.4 Academic Source Citation</w:t>
+        <w:t>A self-contained, reproducible Jupyter Notebook and complete Word project report.</w:t>
       </w:r>
     </w:p>
     <w:p>
@@ -349,16 +428,43 @@
         <w:spacing w:after="40"/>
       </w:pPr>
       <w:r>
-        <w:t>Dataset Reference: Sathishkumar, V. E., Park, J., &amp; Cho, Y. (2020). Using data mining techniques for bike sharing demand prediction in metropolitan city. *Computer Communications*, 153, 353–366. https://doi.org/10.1016/j.comcom.2020.02.007</w:t>
+        <w:t>Notebook Reference: *[Refer to Notebook Cell 1 &amp; Cell 2 for Title, Problem Formulation, and Project Header]*</w:t>
       </w:r>
     </w:p>
     <w:p>
       <w:pPr>
+        <w:pStyle w:val="Heading3"/>
+        <w:spacing w:before="160" w:after="60"/>
+      </w:pPr>
+      <w:r>
+        <w:t>A.4 Dataset Sources &amp; Academic Citations</w:t>
+      </w:r>
+    </w:p>
+    <w:p>
+      <w:pPr>
         <w:pStyle w:val="ListBullet"/>
         <w:spacing w:after="40"/>
       </w:pPr>
       <w:r>
-        <w:t>Data Repository: UCI Machine Learning Repository — Seoul Bike Sharing Demand Dataset.</w:t>
+        <w:t>Academic Reference (APA): Sathishkumar, V. E., Park, J., &amp; Cho, Y. (2020). Using data mining techniques for bike sharing demand prediction in metropolitan city. *Computer Communications*, 153, 353–366. https://doi.org/10.1016/j.comcom.2020.02.007</w:t>
+      </w:r>
+    </w:p>
+    <w:p>
+      <w:pPr>
+        <w:pStyle w:val="ListBullet"/>
+        <w:spacing w:after="40"/>
+      </w:pPr>
+      <w:r>
+        <w:t>Primary Source Repository: UCI Machine Learning Repository — Seoul Bike Sharing Demand Dataset.</w:t>
+      </w:r>
+    </w:p>
+    <w:p>
+      <w:pPr>
+        <w:pStyle w:val="ListBullet"/>
+        <w:spacing w:after="40"/>
+      </w:pPr>
+      <w:r>
+        <w:t>Class Repository Drive Link: [Introduction to Data Science Dataset Repository](https://drive.google.com/drive/folders/1q7oYsHLQp1O4-EI0knAP30U5koZ5cJiI?usp=drive_link)</w:t>
       </w:r>
     </w:p>
     <w:p>
@@ -1696,11 +1802,11 @@
     <w:p/>
     <w:p>
       <w:pPr>
-        <w:pStyle w:val="Heading3"/>
-        <w:spacing w:before="160" w:after="60"/>
+        <w:pStyle w:val="ListBullet"/>
+        <w:spacing w:after="40"/>
       </w:pPr>
       <w:r>
-        <w:t>B.2 Traceable Data Cleaning Log</w:t>
+        <w:t>Notebook Reference: *[Refer to Notebook Cell 4 &amp; Cell 5 for Data Ingestion, Inspection, and `df_raw.info()`]*</w:t>
       </w:r>
     </w:p>
     <w:p>
@@ -1708,15 +1814,16 @@
         <w:spacing w:after="80" w:line="276" w:lineRule="auto"/>
       </w:pPr>
       <w:r>
-        <w:t>To adhere to the rubric's requirement for a traceable cleaning log with verified before-and-after checks, all modifications were recorded systematically:</w:t>
+        <w:t>---</w:t>
       </w:r>
     </w:p>
     <w:p>
       <w:pPr>
-        <w:spacing w:after="80" w:line="276" w:lineRule="auto"/>
+        <w:pStyle w:val="Heading3"/>
+        <w:spacing w:before="160" w:after="60"/>
       </w:pPr>
       <w:r>
-        <w:t>================================================================================</w:t>
+        <w:t>B.2 Traceable Data Preprocessing Log with Step-by-Step Outputs</w:t>
       </w:r>
     </w:p>
     <w:p>
@@ -1724,23 +1831,25 @@
         <w:spacing w:after="80" w:line="276" w:lineRule="auto"/>
       </w:pPr>
       <w:r>
-        <w:t>TRACEABLE CLEANING &amp; INTEGRITY AUDIT LOG</w:t>
+        <w:t>To satisfy the rubric's requirement to *"discuss the preprocessing techniques used and show the output after each technique"*, all actions and verified programmatic outputs are documented below:</w:t>
       </w:r>
     </w:p>
     <w:p>
       <w:pPr>
-        <w:spacing w:after="80" w:line="276" w:lineRule="auto"/>
+        <w:pStyle w:val="Heading4"/>
+        <w:spacing w:before="120" w:after="40"/>
       </w:pPr>
       <w:r>
-        <w:t>================================================================================</w:t>
+        <w:t>Technique 1: Missing Value Audit</w:t>
       </w:r>
     </w:p>
     <w:p>
       <w:pPr>
-        <w:spacing w:after="80" w:line="276" w:lineRule="auto"/>
+        <w:pStyle w:val="ListBullet"/>
+        <w:spacing w:after="40"/>
       </w:pPr>
       <w:r>
-        <w:t>Step 1: Missing Value Audit</w:t>
+        <w:t>Action: Checked for missing or null values across all 14 attributes using `df_raw.isnull().sum()`.</w:t>
       </w:r>
     </w:p>
     <w:p>
@@ -1749,25 +1858,23 @@
         <w:spacing w:after="40"/>
       </w:pPr>
       <w:r>
-        <w:t>Action: Computed isnull().sum() across all 14 columns.</w:t>
+        <w:t>Programmatic Output:</w:t>
       </w:r>
     </w:p>
     <w:p>
       <w:pPr>
-        <w:pStyle w:val="ListBullet"/>
-        <w:spacing w:after="40"/>
+        <w:spacing w:after="80" w:line="276" w:lineRule="auto"/>
       </w:pPr>
       <w:r>
-        <w:t>Result: 0 null values identified. Dataset is 100% complete.</w:t>
+        <w:t>Date                         0</w:t>
       </w:r>
     </w:p>
     <w:p>
       <w:pPr>
-        <w:pStyle w:val="ListBullet"/>
-        <w:spacing w:after="40"/>
+        <w:spacing w:after="80" w:line="276" w:lineRule="auto"/>
       </w:pPr>
       <w:r>
-        <w:t>Justification: No synthetic imputation required; data is organically intact.</w:t>
+        <w:t>Rented Bike Count            0</w:t>
       </w:r>
     </w:p>
     <w:p>
@@ -1775,34 +1882,31 @@
         <w:spacing w:after="80" w:line="276" w:lineRule="auto"/>
       </w:pPr>
       <w:r>
-        <w:t>Step 2: Duplicate Record Audit</w:t>
+        <w:t>Hour                         0</w:t>
       </w:r>
     </w:p>
     <w:p>
       <w:pPr>
-        <w:pStyle w:val="ListBullet"/>
-        <w:spacing w:after="40"/>
+        <w:spacing w:after="80" w:line="276" w:lineRule="auto"/>
       </w:pPr>
       <w:r>
-        <w:t>Action: Executed duplicated().sum() across all rows.</w:t>
+        <w:t>Temperature(°C)              0</w:t>
       </w:r>
     </w:p>
     <w:p>
       <w:pPr>
-        <w:pStyle w:val="ListBullet"/>
-        <w:spacing w:after="40"/>
+        <w:spacing w:after="80" w:line="276" w:lineRule="auto"/>
       </w:pPr>
       <w:r>
-        <w:t>Result: 0 duplicate rows found.</w:t>
+        <w:t>Humidity(%)                  0</w:t>
       </w:r>
     </w:p>
     <w:p>
       <w:pPr>
-        <w:pStyle w:val="ListBullet"/>
-        <w:spacing w:after="40"/>
+        <w:spacing w:after="80" w:line="276" w:lineRule="auto"/>
       </w:pPr>
       <w:r>
-        <w:t>Justification: Exactly 8,760 unique hourly records exist.</w:t>
+        <w:t>Wind speed (m/s)             0</w:t>
       </w:r>
     </w:p>
     <w:p>
@@ -1810,25 +1914,23 @@
         <w:spacing w:after="80" w:line="276" w:lineRule="auto"/>
       </w:pPr>
       <w:r>
-        <w:t>Step 3: Column Name Standardization</w:t>
+        <w:t>Visibility (10m)             0</w:t>
       </w:r>
     </w:p>
     <w:p>
       <w:pPr>
-        <w:pStyle w:val="ListBullet"/>
-        <w:spacing w:after="40"/>
+        <w:spacing w:after="80" w:line="276" w:lineRule="auto"/>
       </w:pPr>
       <w:r>
-        <w:t>Action: Converted all headers to lower_snake_case; stripped parentheses and unicode symbols.</w:t>
+        <w:t>Dew point temperature(°C)    0</w:t>
       </w:r>
     </w:p>
     <w:p>
       <w:pPr>
-        <w:pStyle w:val="ListBullet"/>
-        <w:spacing w:after="40"/>
+        <w:spacing w:after="80" w:line="276" w:lineRule="auto"/>
       </w:pPr>
       <w:r>
-        <w:t>Result: Robust programmatic referencing (e.g., 'Temperature(°C)' -&gt; 'temperature').</w:t>
+        <w:t>Solar Radiation (MJ/m2)      0</w:t>
       </w:r>
     </w:p>
     <w:p>
@@ -1836,34 +1938,31 @@
         <w:spacing w:after="80" w:line="276" w:lineRule="auto"/>
       </w:pPr>
       <w:r>
-        <w:t>Step 4: Temporal Engineering</w:t>
+        <w:t>Rainfall(mm)                 0</w:t>
       </w:r>
     </w:p>
     <w:p>
       <w:pPr>
-        <w:pStyle w:val="ListBullet"/>
-        <w:spacing w:after="40"/>
+        <w:spacing w:after="80" w:line="276" w:lineRule="auto"/>
       </w:pPr>
       <w:r>
-        <w:t>Action: Parsed 'date' string using '%d/%m/%Y' into datetime format.</w:t>
+        <w:t>Snowfall (cm)                0</w:t>
       </w:r>
     </w:p>
     <w:p>
       <w:pPr>
-        <w:pStyle w:val="ListBullet"/>
-        <w:spacing w:after="40"/>
+        <w:spacing w:after="80" w:line="276" w:lineRule="auto"/>
       </w:pPr>
       <w:r>
-        <w:t>Extracted: 'month' (1-12), 'day_of_week' (0=Mon to 6=Sun), and 'is_weekend' (1 for Sat/Sun, 0 otherwise).</w:t>
+        <w:t>Seasons                      0</w:t>
       </w:r>
     </w:p>
     <w:p>
       <w:pPr>
-        <w:pStyle w:val="ListBullet"/>
-        <w:spacing w:after="40"/>
+        <w:spacing w:after="80" w:line="276" w:lineRule="auto"/>
       </w:pPr>
       <w:r>
-        <w:t>Justification: Captures seasonal and commuter cycles without relying on raw date strings.</w:t>
+        <w:t>Holiday                      0</w:t>
       </w:r>
     </w:p>
     <w:p>
@@ -1871,42 +1970,41 @@
         <w:spacing w:after="80" w:line="276" w:lineRule="auto"/>
       </w:pPr>
       <w:r>
-        <w:t>Step 5: Target Variable Formulation</w:t>
+        <w:t>Functioning Day              0</w:t>
       </w:r>
     </w:p>
     <w:p>
       <w:pPr>
-        <w:pStyle w:val="ListBullet"/>
-        <w:spacing w:after="40"/>
+        <w:spacing w:after="80" w:line="276" w:lineRule="auto"/>
       </w:pPr>
       <w:r>
-        <w:t>Action: Applied boolean threshold (rented_bike_count &gt; 0).astype(int).</w:t>
+        <w:t>dtype: int64</w:t>
       </w:r>
     </w:p>
     <w:p>
       <w:pPr>
-        <w:pStyle w:val="ListBullet"/>
-        <w:spacing w:after="40"/>
+        <w:spacing w:after="80" w:line="276" w:lineRule="auto"/>
       </w:pPr>
       <w:r>
-        <w:t>Result: Class 0 (Not Rented) = 295 (3.37%), Class 1 (Rented) = 8,465 (96.63%).</w:t>
+        <w:t>Total Null Values: 0</w:t>
       </w:r>
     </w:p>
     <w:p>
       <w:pPr>
-        <w:spacing w:after="80" w:line="276" w:lineRule="auto"/>
+        <w:pStyle w:val="ListBullet"/>
+        <w:spacing w:after="40"/>
       </w:pPr>
       <w:r>
-        <w:t>Step 6: Critical Data Leakage Prevention Check</w:t>
+        <w:t>Interpretation &amp; Justification: The dataset is 100% organically complete. No synthetic imputation (mean/median/KNN) was required, avoiding artificial distribution distortions.</w:t>
       </w:r>
     </w:p>
     <w:p>
       <w:pPr>
-        <w:pStyle w:val="ListBullet"/>
-        <w:spacing w:after="40"/>
+        <w:pStyle w:val="Heading4"/>
+        <w:spacing w:before="120" w:after="40"/>
       </w:pPr>
       <w:r>
-        <w:t>Audit: Inspected cross-tabulation of functioning_day vs rented_bike_count == 0.</w:t>
+        <w:t>Technique 2: Duplicate Record Audit</w:t>
       </w:r>
     </w:p>
     <w:p>
@@ -1915,50 +2013,50 @@
         <w:spacing w:after="40"/>
       </w:pPr>
       <w:r>
-        <w:t>Discovery: All 295 zero-rental hours occurred exclusively when functioning_day == 'No'.</w:t>
+        <w:t>Action: Checked for duplicate rows across all observations using `df_raw.duplicated().sum()`.</w:t>
       </w:r>
     </w:p>
     <w:p>
       <w:pPr>
-        <w:spacing w:after="80" w:line="276" w:lineRule="auto"/>
+        <w:pStyle w:val="ListBullet"/>
+        <w:spacing w:after="40"/>
       </w:pPr>
       <w:r>
-        <w:t>Zero hours with functioning_day == 'Yes' had 0 rentals.</w:t>
+        <w:t>Programmatic Output:</w:t>
       </w:r>
     </w:p>
     <w:p>
       <w:pPr>
-        <w:pStyle w:val="ListBullet"/>
-        <w:spacing w:after="40"/>
+        <w:spacing w:after="80" w:line="276" w:lineRule="auto"/>
       </w:pPr>
       <w:r>
-        <w:t>Remediation: DROPPED 'functioning_day' from predictor matrix X.</w:t>
+        <w:t>Total Duplicate Rows Found: 0</w:t>
       </w:r>
     </w:p>
     <w:p>
       <w:pPr>
-        <w:pStyle w:val="ListBullet"/>
-        <w:spacing w:after="40"/>
+        <w:spacing w:after="80" w:line="276" w:lineRule="auto"/>
       </w:pPr>
       <w:r>
-        <w:t>Justification: Strictly enforces learning outcome #3 ("Train without leaking test data into preprocessing").</w:t>
+        <w:t>Unique Timestamps Verified: 8,760 / 8,760</w:t>
       </w:r>
     </w:p>
     <w:p>
       <w:pPr>
-        <w:spacing w:after="80" w:line="276" w:lineRule="auto"/>
+        <w:pStyle w:val="ListBullet"/>
+        <w:spacing w:after="40"/>
       </w:pPr>
       <w:r>
-        <w:t>Step 7: Multicollinearity Resolution</w:t>
+        <w:t>Interpretation &amp; Justification: Exactly 8,760 unique hourly records exist. No rows were dropped or duplicated.</w:t>
       </w:r>
     </w:p>
     <w:p>
       <w:pPr>
-        <w:pStyle w:val="ListBullet"/>
-        <w:spacing w:after="40"/>
+        <w:pStyle w:val="Heading4"/>
+        <w:spacing w:before="120" w:after="40"/>
       </w:pPr>
       <w:r>
-        <w:t>Audit: Computed Pearson correlation between temperature and dew_point_temperature (r = 0.9128).</w:t>
+        <w:t>Technique 3: Column Name Standardization</w:t>
       </w:r>
     </w:p>
     <w:p>
@@ -1967,7 +2065,7 @@
         <w:spacing w:after="40"/>
       </w:pPr>
       <w:r>
-        <w:t>Remediation: DROPPED 'dew_point_temperature'.</w:t>
+        <w:t>Action: Standardized irregular column headers into lowercase `snake_case`, stripping unit symbols, parentheses, and special characters.</w:t>
       </w:r>
     </w:p>
     <w:p>
@@ -1976,7 +2074,7 @@
         <w:spacing w:after="40"/>
       </w:pPr>
       <w:r>
-        <w:t>Justification: Eliminates variance inflation in linear and distance-based estimators.</w:t>
+        <w:t>Programmatic Output:</w:t>
       </w:r>
     </w:p>
     <w:p>
@@ -1984,16 +2082,350 @@
         <w:spacing w:after="80" w:line="276" w:lineRule="auto"/>
       </w:pPr>
       <w:r>
-        <w:t>================================================================================</w:t>
+        <w:t>Original Headers: ['Date', 'Rented Bike Count', 'Hour', 'Temperature(°C)', 'Humidity(%)', 'Wind speed (m/s)', 'Visibility (10m)', 'Dew point temperature(°C)', 'Solar Radiation (MJ/m2)', 'Rainfall(mm)', 'Snowfall (cm)', 'Seasons', 'Holiday', 'Functioning Day']</w:t>
       </w:r>
     </w:p>
     <w:p>
       <w:pPr>
+        <w:spacing w:after="80" w:line="276" w:lineRule="auto"/>
+      </w:pPr>
+      <w:r>
+        <w:t>Standardized:     ['date', 'rented_bike_count', 'hour', 'temperature', 'humidity', 'wind_speed', 'visibility', 'dew_point_temperature', 'solar_radiation', 'rainfall', 'snowfall', 'season', 'holiday', 'functioning_day']</w:t>
+      </w:r>
+    </w:p>
+    <w:p>
+      <w:pPr>
+        <w:pStyle w:val="ListBullet"/>
+        <w:spacing w:after="40"/>
+      </w:pPr>
+      <w:r>
+        <w:t>Interpretation &amp; Justification: Ensures programmatic robustness across Python scripts and prevents syntax errors when referencing columns in Scikit-Learn pipelines.</w:t>
+      </w:r>
+    </w:p>
+    <w:p>
+      <w:pPr>
         <w:pStyle w:val="Heading4"/>
         <w:spacing w:before="120" w:after="40"/>
       </w:pPr>
       <w:r>
-        <w:t>Before and After Preprocessing Comparison</w:t>
+        <w:t>Technique 4: Temporal Feature Extraction</w:t>
+      </w:r>
+    </w:p>
+    <w:p>
+      <w:pPr>
+        <w:pStyle w:val="ListBullet"/>
+        <w:spacing w:after="40"/>
+      </w:pPr>
+      <w:r>
+        <w:t>Action: Parsed the raw `date` string (`DD/MM/YYYY`) into a `datetime64[ns]` series and extracted three cyclical temporal predictors: `month` (1–12), `day_of_week` (0=Monday to 6=Sunday), and `is_weekend` (1 for Saturday/Sunday, 0 otherwise).</w:t>
+      </w:r>
+    </w:p>
+    <w:p>
+      <w:pPr>
+        <w:pStyle w:val="ListBullet"/>
+        <w:spacing w:after="40"/>
+      </w:pPr>
+      <w:r>
+        <w:t>Programmatic Output (Sample Snapshot):</w:t>
+      </w:r>
+    </w:p>
+    <w:p>
+      <w:pPr>
+        <w:spacing w:after="80" w:line="276" w:lineRule="auto"/>
+      </w:pPr>
+      <w:r>
+        <w:t>date    date_dt  month  day_of_week  is_weekend</w:t>
+      </w:r>
+    </w:p>
+    <w:p>
+      <w:pPr>
+        <w:spacing w:after="80" w:line="276" w:lineRule="auto"/>
+      </w:pPr>
+      <w:r>
+        <w:t>0  01/12/2017 2017-12-01     12            4           0</w:t>
+      </w:r>
+    </w:p>
+    <w:p>
+      <w:pPr>
+        <w:spacing w:after="80" w:line="276" w:lineRule="auto"/>
+      </w:pPr>
+      <w:r>
+        <w:t>1  01/12/2017 2017-12-01     12            4           0</w:t>
+      </w:r>
+    </w:p>
+    <w:p>
+      <w:pPr>
+        <w:spacing w:after="80" w:line="276" w:lineRule="auto"/>
+      </w:pPr>
+      <w:r>
+        <w:t>24 02/12/2017 2017-12-02     12            5           1</w:t>
+      </w:r>
+    </w:p>
+    <w:p>
+      <w:pPr>
+        <w:pStyle w:val="ListBullet"/>
+        <w:spacing w:after="40"/>
+      </w:pPr>
+      <w:r>
+        <w:t>Interpretation &amp; Justification: Transforms raw calendar dates into structured cyclical features that allow linear and tree models to differentiate weekday commuter rushes from weekend leisure travel.</w:t>
+      </w:r>
+    </w:p>
+    <w:p>
+      <w:pPr>
+        <w:pStyle w:val="Heading4"/>
+        <w:spacing w:before="120" w:after="40"/>
+      </w:pPr>
+      <w:r>
+        <w:t>Technique 5: Target Variable Formulation</w:t>
+      </w:r>
+    </w:p>
+    <w:p>
+      <w:pPr>
+        <w:pStyle w:val="ListBullet"/>
+        <w:spacing w:after="40"/>
+      </w:pPr>
+      <w:r>
+        <w:t>Action: Converted the continuous `rented_bike_count` into the binary target `is_rented`:</w:t>
+      </w:r>
+    </w:p>
+    <w:p>
+      <w:pPr>
+        <w:spacing w:after="80" w:line="276" w:lineRule="auto"/>
+      </w:pPr>
+      <w:r>
+        <w:t>`df['is_rented'] = (df['rented_bike_count'] &gt; 0).astype(int)`</w:t>
+      </w:r>
+    </w:p>
+    <w:p>
+      <w:pPr>
+        <w:pStyle w:val="ListBullet"/>
+        <w:spacing w:after="40"/>
+      </w:pPr>
+      <w:r>
+        <w:t>Programmatic Output:</w:t>
+      </w:r>
+    </w:p>
+    <w:p>
+      <w:pPr>
+        <w:spacing w:after="80" w:line="276" w:lineRule="auto"/>
+      </w:pPr>
+      <w:r>
+        <w:t>is_rented Value Counts:</w:t>
+      </w:r>
+    </w:p>
+    <w:p>
+      <w:pPr>
+        <w:spacing w:after="80" w:line="276" w:lineRule="auto"/>
+      </w:pPr>
+      <w:r>
+        <w:t>Class 1 (Active Rental): 8,465 hours (96.63%)</w:t>
+      </w:r>
+    </w:p>
+    <w:p>
+      <w:pPr>
+        <w:spacing w:after="80" w:line="276" w:lineRule="auto"/>
+      </w:pPr>
+      <w:r>
+        <w:t>Class 0 (Zero Demand):     295 hours ( 3.37%)</w:t>
+      </w:r>
+    </w:p>
+    <w:p>
+      <w:pPr>
+        <w:spacing w:after="80" w:line="276" w:lineRule="auto"/>
+      </w:pPr>
+      <w:r>
+        <w:t>Total Records:           8,760 hours (100.0%)</w:t>
+      </w:r>
+    </w:p>
+    <w:p>
+      <w:pPr>
+        <w:pStyle w:val="ListBullet"/>
+        <w:spacing w:after="40"/>
+      </w:pPr>
+      <w:r>
+        <w:t>Interpretation &amp; Justification: Establishes the binary classification ground truth while demonstrating extreme class imbalance (3.37% minority class).</w:t>
+      </w:r>
+    </w:p>
+    <w:p>
+      <w:pPr>
+        <w:pStyle w:val="Heading4"/>
+        <w:spacing w:before="120" w:after="40"/>
+      </w:pPr>
+      <w:r>
+        <w:t>Technique 6: Critical Data Leakage Prevention Audit</w:t>
+      </w:r>
+    </w:p>
+    <w:p>
+      <w:pPr>
+        <w:pStyle w:val="ListBullet"/>
+        <w:spacing w:after="40"/>
+      </w:pPr>
+      <w:r>
+        <w:t>Action: Cross-tabulated `functioning_day` against `is_rented`.</w:t>
+      </w:r>
+    </w:p>
+    <w:p>
+      <w:pPr>
+        <w:pStyle w:val="ListBullet"/>
+        <w:spacing w:after="40"/>
+      </w:pPr>
+      <w:r>
+        <w:t>Programmatic Output:</w:t>
+      </w:r>
+    </w:p>
+    <w:p>
+      <w:pPr>
+        <w:spacing w:after="80" w:line="276" w:lineRule="auto"/>
+      </w:pPr>
+      <w:r>
+        <w:t>Cross-Tabulation: functioning_day vs is_rented</w:t>
+      </w:r>
+    </w:p>
+    <w:p>
+      <w:pPr>
+        <w:spacing w:after="80" w:line="276" w:lineRule="auto"/>
+      </w:pPr>
+      <w:r>
+        <w:t>is_rented            0     1   Total</w:t>
+      </w:r>
+    </w:p>
+    <w:p>
+      <w:pPr>
+        <w:spacing w:after="80" w:line="276" w:lineRule="auto"/>
+      </w:pPr>
+      <w:r>
+        <w:t>functioning_day</w:t>
+      </w:r>
+    </w:p>
+    <w:p>
+      <w:pPr>
+        <w:spacing w:after="80" w:line="276" w:lineRule="auto"/>
+      </w:pPr>
+      <w:r>
+        <w:t>No                 295     0     295</w:t>
+      </w:r>
+    </w:p>
+    <w:p>
+      <w:pPr>
+        <w:spacing w:after="80" w:line="276" w:lineRule="auto"/>
+      </w:pPr>
+      <w:r>
+        <w:t>Yes                  0  8465    8465</w:t>
+      </w:r>
+    </w:p>
+    <w:p>
+      <w:pPr>
+        <w:spacing w:after="80" w:line="276" w:lineRule="auto"/>
+      </w:pPr>
+      <w:r>
+        <w:t>Total              295  8465    8760</w:t>
+      </w:r>
+    </w:p>
+    <w:p>
+      <w:pPr>
+        <w:pStyle w:val="ListBullet"/>
+        <w:spacing w:after="40"/>
+      </w:pPr>
+      <w:r>
+        <w:t>Discovery &amp; Action Taken:</w:t>
+      </w:r>
+    </w:p>
+    <w:p>
+      <w:pPr>
+        <w:pStyle w:val="ListBullet"/>
+        <w:spacing w:after="40"/>
+      </w:pPr>
+      <w:r>
+        <w:t>All 295 hours where zero rentals occurred occurred exclusively when `functioning_day == 'No'`.</w:t>
+      </w:r>
+    </w:p>
+    <w:p>
+      <w:pPr>
+        <w:pStyle w:val="ListBullet"/>
+        <w:spacing w:after="40"/>
+      </w:pPr>
+      <w:r>
+        <w:t>Exactly zero hours with `functioning_day == 'Yes'` had zero rentals.</w:t>
+      </w:r>
+    </w:p>
+    <w:p>
+      <w:pPr>
+        <w:pStyle w:val="ListBullet"/>
+        <w:spacing w:after="40"/>
+      </w:pPr>
+      <w:r>
+        <w:t>`functioning_day` has a 100% deterministic mathematical correlation with the target. Including it in $X$ would allow models to achieve artificial 100% test accuracy without learning any environmental or demand patterns.</w:t>
+      </w:r>
+    </w:p>
+    <w:p>
+      <w:pPr>
+        <w:pStyle w:val="ListBullet"/>
+        <w:spacing w:after="40"/>
+      </w:pPr>
+      <w:r>
+        <w:t>Remediation: `functioning_day` was strictly dropped from the feature matrix $X$.</w:t>
+      </w:r>
+    </w:p>
+    <w:p>
+      <w:pPr>
+        <w:pStyle w:val="ListBullet"/>
+        <w:spacing w:after="40"/>
+      </w:pPr>
+      <w:r>
+        <w:t>Learning Outcome Compliance: Fulfills Learning Outcome #3 (*"Train a simple model without leaking test data into preprocessing"*).</w:t>
+      </w:r>
+    </w:p>
+    <w:p>
+      <w:pPr>
+        <w:pStyle w:val="Heading4"/>
+        <w:spacing w:before="120" w:after="40"/>
+      </w:pPr>
+      <w:r>
+        <w:t>Technique 7: Multicollinearity Resolution</w:t>
+      </w:r>
+    </w:p>
+    <w:p>
+      <w:pPr>
+        <w:pStyle w:val="ListBullet"/>
+        <w:spacing w:after="40"/>
+      </w:pPr>
+      <w:r>
+        <w:t>Action: Computed pairwise Pearson correlations among continuous features.</w:t>
+      </w:r>
+    </w:p>
+    <w:p>
+      <w:pPr>
+        <w:pStyle w:val="ListBullet"/>
+        <w:spacing w:after="40"/>
+      </w:pPr>
+      <w:r>
+        <w:t>Programmatic Output:</w:t>
+      </w:r>
+    </w:p>
+    <w:p>
+      <w:pPr>
+        <w:spacing w:after="80" w:line="276" w:lineRule="auto"/>
+      </w:pPr>
+      <w:r>
+        <w:t>Correlation (temperature, dew_point_temperature): r = 0.9128</w:t>
+      </w:r>
+    </w:p>
+    <w:p>
+      <w:pPr>
+        <w:pStyle w:val="ListBullet"/>
+        <w:spacing w:after="40"/>
+      </w:pPr>
+      <w:r>
+        <w:t>Action Taken: `dew_point_temperature` was dropped from $X$ to eliminate variance inflation in linear and distance-based estimators.</w:t>
+      </w:r>
+    </w:p>
+    <w:p>
+      <w:pPr>
+        <w:pStyle w:val="Heading4"/>
+        <w:spacing w:before="120" w:after="40"/>
+      </w:pPr>
+      <w:r>
+        <w:t>Summary: Before and After Preprocessing Comparison</w:t>
       </w:r>
     </w:p>
     <w:tbl>
@@ -2287,7 +2719,7 @@
               <w:rPr>
                 <w:sz w:val="18"/>
               </w:rPr>
-              <w:t>Leakage Columns</w:t>
+              <w:t>Duplicate Rows</w:t>
             </w:r>
           </w:p>
         </w:tc>
@@ -2304,7 +2736,7 @@
               <w:rPr>
                 <w:sz w:val="18"/>
               </w:rPr>
-              <w:t>Present (`functioning_day`, `date`)</w:t>
+              <w:t>0 (0.0%)</w:t>
             </w:r>
           </w:p>
         </w:tc>
@@ -2321,7 +2753,7 @@
               <w:rPr>
                 <w:sz w:val="18"/>
               </w:rPr>
-              <w:t>Completely Removed</w:t>
+              <w:t>0 (0.0%)</w:t>
             </w:r>
           </w:p>
         </w:tc>
@@ -2339,6 +2771,57 @@
               <w:rPr>
                 <w:sz w:val="18"/>
               </w:rPr>
+              <w:t>Leakage Columns</w:t>
+            </w:r>
+          </w:p>
+        </w:tc>
+        <w:tc>
+          <w:tcPr>
+            <w:tcW w:type="dxa" w:w="3120"/>
+          </w:tcPr>
+          <w:p>
+            <w:pPr>
+              <w:spacing w:before="60" w:after="60"/>
+            </w:pPr>
+            <w:r>
+              <w:rPr>
+                <w:sz w:val="18"/>
+              </w:rPr>
+              <w:t>Present (`functioning_day`, `date`)</w:t>
+            </w:r>
+          </w:p>
+        </w:tc>
+        <w:tc>
+          <w:tcPr>
+            <w:tcW w:type="dxa" w:w="3120"/>
+          </w:tcPr>
+          <w:p>
+            <w:pPr>
+              <w:spacing w:before="60" w:after="60"/>
+            </w:pPr>
+            <w:r>
+              <w:rPr>
+                <w:sz w:val="18"/>
+              </w:rPr>
+              <w:t>Completely Removed</w:t>
+            </w:r>
+          </w:p>
+        </w:tc>
+      </w:tr>
+      <w:tr>
+        <w:tc>
+          <w:tcPr>
+            <w:tcW w:type="dxa" w:w="3120"/>
+            <w:shd w:val="clear" w:color="auto" w:fill="F5F5F5"/>
+          </w:tcPr>
+          <w:p>
+            <w:pPr>
+              <w:spacing w:before="60" w:after="60"/>
+            </w:pPr>
+            <w:r>
+              <w:rPr>
+                <w:sz w:val="18"/>
+              </w:rPr>
               <w:t>Multicollinear Columns</w:t>
             </w:r>
           </w:p>
@@ -2346,6 +2829,7 @@
         <w:tc>
           <w:tcPr>
             <w:tcW w:type="dxa" w:w="3120"/>
+            <w:shd w:val="clear" w:color="auto" w:fill="F5F5F5"/>
           </w:tcPr>
           <w:p>
             <w:pPr>
@@ -2362,6 +2846,7 @@
         <w:tc>
           <w:tcPr>
             <w:tcW w:type="dxa" w:w="3120"/>
+            <w:shd w:val="clear" w:color="auto" w:fill="F5F5F5"/>
           </w:tcPr>
           <w:p>
             <w:pPr>
@@ -2378,6 +2863,15 @@
       </w:tr>
     </w:tbl>
     <w:p/>
+    <w:p>
+      <w:pPr>
+        <w:pStyle w:val="ListBullet"/>
+        <w:spacing w:after="40"/>
+      </w:pPr>
+      <w:r>
+        <w:t>Notebook Reference: *[Refer to Notebook Cell 6, Cell 7 &amp; Cell 8 for Code Implementation and Leakage Audit Outputs]*</w:t>
+      </w:r>
+    </w:p>
     <w:p>
       <w:pPr>
         <w:spacing w:after="80" w:line="276" w:lineRule="auto"/>
@@ -2392,7 +2886,1283 @@
         <w:spacing w:before="160" w:after="60"/>
       </w:pPr>
       <w:r>
-        <w:t>B.3 Exploratory Data Analysis (EDA) &amp; Interpretations</w:t>
+        <w:t>B.3 Numerical Feature Summary Statistics</w:t>
+      </w:r>
+    </w:p>
+    <w:p>
+      <w:pPr>
+        <w:spacing w:after="80" w:line="276" w:lineRule="auto"/>
+      </w:pPr>
+      <w:r>
+        <w:t>To provide exact distributional summaries alongside the visual plots:</w:t>
+      </w:r>
+    </w:p>
+    <w:tbl>
+      <w:tblPr>
+        <w:tblStyle w:val="TableGrid"/>
+        <w:tblW w:type="auto" w:w="0"/>
+        <w:jc w:val="center"/>
+        <w:tblLook w:firstColumn="1" w:firstRow="1" w:lastColumn="0" w:lastRow="0" w:noHBand="0" w:noVBand="1" w:val="04A0"/>
+      </w:tblPr>
+      <w:tblGrid>
+        <w:gridCol w:w="1040"/>
+        <w:gridCol w:w="1040"/>
+        <w:gridCol w:w="1040"/>
+        <w:gridCol w:w="1040"/>
+        <w:gridCol w:w="1040"/>
+        <w:gridCol w:w="1040"/>
+        <w:gridCol w:w="1040"/>
+        <w:gridCol w:w="1040"/>
+        <w:gridCol w:w="1040"/>
+      </w:tblGrid>
+      <w:tr>
+        <w:tc>
+          <w:tcPr>
+            <w:tcW w:type="dxa" w:w="1040"/>
+            <w:shd w:val="clear" w:color="auto" w:fill="2E7D32"/>
+          </w:tcPr>
+          <w:p>
+            <w:pPr>
+              <w:spacing w:before="60" w:after="60"/>
+            </w:pPr>
+            <w:r>
+              <w:rPr>
+                <w:b/>
+                <w:color w:val="FFFFFF"/>
+                <w:sz w:val="19"/>
+              </w:rPr>
+              <w:t>Feature Name</w:t>
+            </w:r>
+          </w:p>
+        </w:tc>
+        <w:tc>
+          <w:tcPr>
+            <w:tcW w:type="dxa" w:w="1040"/>
+            <w:shd w:val="clear" w:color="auto" w:fill="2E7D32"/>
+          </w:tcPr>
+          <w:p>
+            <w:pPr>
+              <w:spacing w:before="60" w:after="60"/>
+            </w:pPr>
+            <w:r>
+              <w:rPr>
+                <w:b/>
+                <w:color w:val="FFFFFF"/>
+                <w:sz w:val="19"/>
+              </w:rPr>
+              <w:t>Count</w:t>
+            </w:r>
+          </w:p>
+        </w:tc>
+        <w:tc>
+          <w:tcPr>
+            <w:tcW w:type="dxa" w:w="1040"/>
+            <w:shd w:val="clear" w:color="auto" w:fill="2E7D32"/>
+          </w:tcPr>
+          <w:p>
+            <w:pPr>
+              <w:spacing w:before="60" w:after="60"/>
+            </w:pPr>
+            <w:r>
+              <w:rPr>
+                <w:b/>
+                <w:color w:val="FFFFFF"/>
+                <w:sz w:val="19"/>
+              </w:rPr>
+              <w:t>Mean</w:t>
+            </w:r>
+          </w:p>
+        </w:tc>
+        <w:tc>
+          <w:tcPr>
+            <w:tcW w:type="dxa" w:w="1040"/>
+            <w:shd w:val="clear" w:color="auto" w:fill="2E7D32"/>
+          </w:tcPr>
+          <w:p>
+            <w:pPr>
+              <w:spacing w:before="60" w:after="60"/>
+            </w:pPr>
+            <w:r>
+              <w:rPr>
+                <w:b/>
+                <w:color w:val="FFFFFF"/>
+                <w:sz w:val="19"/>
+              </w:rPr>
+              <w:t>Std Dev</w:t>
+            </w:r>
+          </w:p>
+        </w:tc>
+        <w:tc>
+          <w:tcPr>
+            <w:tcW w:type="dxa" w:w="1040"/>
+            <w:shd w:val="clear" w:color="auto" w:fill="2E7D32"/>
+          </w:tcPr>
+          <w:p>
+            <w:pPr>
+              <w:spacing w:before="60" w:after="60"/>
+            </w:pPr>
+            <w:r>
+              <w:rPr>
+                <w:b/>
+                <w:color w:val="FFFFFF"/>
+                <w:sz w:val="19"/>
+              </w:rPr>
+              <w:t>Min</w:t>
+            </w:r>
+          </w:p>
+        </w:tc>
+        <w:tc>
+          <w:tcPr>
+            <w:tcW w:type="dxa" w:w="1040"/>
+            <w:shd w:val="clear" w:color="auto" w:fill="2E7D32"/>
+          </w:tcPr>
+          <w:p>
+            <w:pPr>
+              <w:spacing w:before="60" w:after="60"/>
+            </w:pPr>
+            <w:r>
+              <w:rPr>
+                <w:b/>
+                <w:color w:val="FFFFFF"/>
+                <w:sz w:val="19"/>
+              </w:rPr>
+              <w:t>25%</w:t>
+            </w:r>
+          </w:p>
+        </w:tc>
+        <w:tc>
+          <w:tcPr>
+            <w:tcW w:type="dxa" w:w="1040"/>
+            <w:shd w:val="clear" w:color="auto" w:fill="2E7D32"/>
+          </w:tcPr>
+          <w:p>
+            <w:pPr>
+              <w:spacing w:before="60" w:after="60"/>
+            </w:pPr>
+            <w:r>
+              <w:rPr>
+                <w:b/>
+                <w:color w:val="FFFFFF"/>
+                <w:sz w:val="19"/>
+              </w:rPr>
+              <w:t>Median (50%)</w:t>
+            </w:r>
+          </w:p>
+        </w:tc>
+        <w:tc>
+          <w:tcPr>
+            <w:tcW w:type="dxa" w:w="1040"/>
+            <w:shd w:val="clear" w:color="auto" w:fill="2E7D32"/>
+          </w:tcPr>
+          <w:p>
+            <w:pPr>
+              <w:spacing w:before="60" w:after="60"/>
+            </w:pPr>
+            <w:r>
+              <w:rPr>
+                <w:b/>
+                <w:color w:val="FFFFFF"/>
+                <w:sz w:val="19"/>
+              </w:rPr>
+              <w:t>75%</w:t>
+            </w:r>
+          </w:p>
+        </w:tc>
+        <w:tc>
+          <w:tcPr>
+            <w:tcW w:type="dxa" w:w="1040"/>
+            <w:shd w:val="clear" w:color="auto" w:fill="2E7D32"/>
+          </w:tcPr>
+          <w:p>
+            <w:pPr>
+              <w:spacing w:before="60" w:after="60"/>
+            </w:pPr>
+            <w:r>
+              <w:rPr>
+                <w:b/>
+                <w:color w:val="FFFFFF"/>
+                <w:sz w:val="19"/>
+              </w:rPr>
+              <w:t>Max</w:t>
+            </w:r>
+          </w:p>
+        </w:tc>
+      </w:tr>
+      <w:tr>
+        <w:tc>
+          <w:tcPr>
+            <w:tcW w:type="dxa" w:w="1040"/>
+            <w:shd w:val="clear" w:color="auto" w:fill="F5F5F5"/>
+          </w:tcPr>
+          <w:p>
+            <w:pPr>
+              <w:spacing w:before="60" w:after="60"/>
+            </w:pPr>
+            <w:r>
+              <w:rPr>
+                <w:sz w:val="18"/>
+              </w:rPr>
+              <w:t>`temperature` (°C)</w:t>
+            </w:r>
+          </w:p>
+        </w:tc>
+        <w:tc>
+          <w:tcPr>
+            <w:tcW w:type="dxa" w:w="1040"/>
+            <w:shd w:val="clear" w:color="auto" w:fill="F5F5F5"/>
+          </w:tcPr>
+          <w:p>
+            <w:pPr>
+              <w:spacing w:before="60" w:after="60"/>
+            </w:pPr>
+            <w:r>
+              <w:rPr>
+                <w:sz w:val="18"/>
+              </w:rPr>
+              <w:t>8,760</w:t>
+            </w:r>
+          </w:p>
+        </w:tc>
+        <w:tc>
+          <w:tcPr>
+            <w:tcW w:type="dxa" w:w="1040"/>
+            <w:shd w:val="clear" w:color="auto" w:fill="F5F5F5"/>
+          </w:tcPr>
+          <w:p>
+            <w:pPr>
+              <w:spacing w:before="60" w:after="60"/>
+            </w:pPr>
+            <w:r>
+              <w:rPr>
+                <w:sz w:val="18"/>
+              </w:rPr>
+              <w:t>12.88</w:t>
+            </w:r>
+          </w:p>
+        </w:tc>
+        <w:tc>
+          <w:tcPr>
+            <w:tcW w:type="dxa" w:w="1040"/>
+            <w:shd w:val="clear" w:color="auto" w:fill="F5F5F5"/>
+          </w:tcPr>
+          <w:p>
+            <w:pPr>
+              <w:spacing w:before="60" w:after="60"/>
+            </w:pPr>
+            <w:r>
+              <w:rPr>
+                <w:sz w:val="18"/>
+              </w:rPr>
+              <w:t>11.94</w:t>
+            </w:r>
+          </w:p>
+        </w:tc>
+        <w:tc>
+          <w:tcPr>
+            <w:tcW w:type="dxa" w:w="1040"/>
+            <w:shd w:val="clear" w:color="auto" w:fill="F5F5F5"/>
+          </w:tcPr>
+          <w:p>
+            <w:pPr>
+              <w:spacing w:before="60" w:after="60"/>
+            </w:pPr>
+            <w:r>
+              <w:rPr>
+                <w:sz w:val="18"/>
+              </w:rPr>
+              <w:t>-17.80</w:t>
+            </w:r>
+          </w:p>
+        </w:tc>
+        <w:tc>
+          <w:tcPr>
+            <w:tcW w:type="dxa" w:w="1040"/>
+            <w:shd w:val="clear" w:color="auto" w:fill="F5F5F5"/>
+          </w:tcPr>
+          <w:p>
+            <w:pPr>
+              <w:spacing w:before="60" w:after="60"/>
+            </w:pPr>
+            <w:r>
+              <w:rPr>
+                <w:sz w:val="18"/>
+              </w:rPr>
+              <w:t>3.50</w:t>
+            </w:r>
+          </w:p>
+        </w:tc>
+        <w:tc>
+          <w:tcPr>
+            <w:tcW w:type="dxa" w:w="1040"/>
+            <w:shd w:val="clear" w:color="auto" w:fill="F5F5F5"/>
+          </w:tcPr>
+          <w:p>
+            <w:pPr>
+              <w:spacing w:before="60" w:after="60"/>
+            </w:pPr>
+            <w:r>
+              <w:rPr>
+                <w:sz w:val="18"/>
+              </w:rPr>
+              <w:t>13.70</w:t>
+            </w:r>
+          </w:p>
+        </w:tc>
+        <w:tc>
+          <w:tcPr>
+            <w:tcW w:type="dxa" w:w="1040"/>
+            <w:shd w:val="clear" w:color="auto" w:fill="F5F5F5"/>
+          </w:tcPr>
+          <w:p>
+            <w:pPr>
+              <w:spacing w:before="60" w:after="60"/>
+            </w:pPr>
+            <w:r>
+              <w:rPr>
+                <w:sz w:val="18"/>
+              </w:rPr>
+              <w:t>22.50</w:t>
+            </w:r>
+          </w:p>
+        </w:tc>
+        <w:tc>
+          <w:tcPr>
+            <w:tcW w:type="dxa" w:w="1040"/>
+            <w:shd w:val="clear" w:color="auto" w:fill="F5F5F5"/>
+          </w:tcPr>
+          <w:p>
+            <w:pPr>
+              <w:spacing w:before="60" w:after="60"/>
+            </w:pPr>
+            <w:r>
+              <w:rPr>
+                <w:sz w:val="18"/>
+              </w:rPr>
+              <w:t>39.40</w:t>
+            </w:r>
+          </w:p>
+        </w:tc>
+      </w:tr>
+      <w:tr>
+        <w:tc>
+          <w:tcPr>
+            <w:tcW w:type="dxa" w:w="1040"/>
+          </w:tcPr>
+          <w:p>
+            <w:pPr>
+              <w:spacing w:before="60" w:after="60"/>
+            </w:pPr>
+            <w:r>
+              <w:rPr>
+                <w:sz w:val="18"/>
+              </w:rPr>
+              <w:t>`humidity` (%)</w:t>
+            </w:r>
+          </w:p>
+        </w:tc>
+        <w:tc>
+          <w:tcPr>
+            <w:tcW w:type="dxa" w:w="1040"/>
+          </w:tcPr>
+          <w:p>
+            <w:pPr>
+              <w:spacing w:before="60" w:after="60"/>
+            </w:pPr>
+            <w:r>
+              <w:rPr>
+                <w:sz w:val="18"/>
+              </w:rPr>
+              <w:t>8,760</w:t>
+            </w:r>
+          </w:p>
+        </w:tc>
+        <w:tc>
+          <w:tcPr>
+            <w:tcW w:type="dxa" w:w="1040"/>
+          </w:tcPr>
+          <w:p>
+            <w:pPr>
+              <w:spacing w:before="60" w:after="60"/>
+            </w:pPr>
+            <w:r>
+              <w:rPr>
+                <w:sz w:val="18"/>
+              </w:rPr>
+              <w:t>58.23</w:t>
+            </w:r>
+          </w:p>
+        </w:tc>
+        <w:tc>
+          <w:tcPr>
+            <w:tcW w:type="dxa" w:w="1040"/>
+          </w:tcPr>
+          <w:p>
+            <w:pPr>
+              <w:spacing w:before="60" w:after="60"/>
+            </w:pPr>
+            <w:r>
+              <w:rPr>
+                <w:sz w:val="18"/>
+              </w:rPr>
+              <w:t>20.36</w:t>
+            </w:r>
+          </w:p>
+        </w:tc>
+        <w:tc>
+          <w:tcPr>
+            <w:tcW w:type="dxa" w:w="1040"/>
+          </w:tcPr>
+          <w:p>
+            <w:pPr>
+              <w:spacing w:before="60" w:after="60"/>
+            </w:pPr>
+            <w:r>
+              <w:rPr>
+                <w:sz w:val="18"/>
+              </w:rPr>
+              <w:t>0.00</w:t>
+            </w:r>
+          </w:p>
+        </w:tc>
+        <w:tc>
+          <w:tcPr>
+            <w:tcW w:type="dxa" w:w="1040"/>
+          </w:tcPr>
+          <w:p>
+            <w:pPr>
+              <w:spacing w:before="60" w:after="60"/>
+            </w:pPr>
+            <w:r>
+              <w:rPr>
+                <w:sz w:val="18"/>
+              </w:rPr>
+              <w:t>42.00</w:t>
+            </w:r>
+          </w:p>
+        </w:tc>
+        <w:tc>
+          <w:tcPr>
+            <w:tcW w:type="dxa" w:w="1040"/>
+          </w:tcPr>
+          <w:p>
+            <w:pPr>
+              <w:spacing w:before="60" w:after="60"/>
+            </w:pPr>
+            <w:r>
+              <w:rPr>
+                <w:sz w:val="18"/>
+              </w:rPr>
+              <w:t>57.00</w:t>
+            </w:r>
+          </w:p>
+        </w:tc>
+        <w:tc>
+          <w:tcPr>
+            <w:tcW w:type="dxa" w:w="1040"/>
+          </w:tcPr>
+          <w:p>
+            <w:pPr>
+              <w:spacing w:before="60" w:after="60"/>
+            </w:pPr>
+            <w:r>
+              <w:rPr>
+                <w:sz w:val="18"/>
+              </w:rPr>
+              <w:t>74.00</w:t>
+            </w:r>
+          </w:p>
+        </w:tc>
+        <w:tc>
+          <w:tcPr>
+            <w:tcW w:type="dxa" w:w="1040"/>
+          </w:tcPr>
+          <w:p>
+            <w:pPr>
+              <w:spacing w:before="60" w:after="60"/>
+            </w:pPr>
+            <w:r>
+              <w:rPr>
+                <w:sz w:val="18"/>
+              </w:rPr>
+              <w:t>98.00</w:t>
+            </w:r>
+          </w:p>
+        </w:tc>
+      </w:tr>
+      <w:tr>
+        <w:tc>
+          <w:tcPr>
+            <w:tcW w:type="dxa" w:w="1040"/>
+            <w:shd w:val="clear" w:color="auto" w:fill="F5F5F5"/>
+          </w:tcPr>
+          <w:p>
+            <w:pPr>
+              <w:spacing w:before="60" w:after="60"/>
+            </w:pPr>
+            <w:r>
+              <w:rPr>
+                <w:sz w:val="18"/>
+              </w:rPr>
+              <w:t>`wind_speed` (m/s)</w:t>
+            </w:r>
+          </w:p>
+        </w:tc>
+        <w:tc>
+          <w:tcPr>
+            <w:tcW w:type="dxa" w:w="1040"/>
+            <w:shd w:val="clear" w:color="auto" w:fill="F5F5F5"/>
+          </w:tcPr>
+          <w:p>
+            <w:pPr>
+              <w:spacing w:before="60" w:after="60"/>
+            </w:pPr>
+            <w:r>
+              <w:rPr>
+                <w:sz w:val="18"/>
+              </w:rPr>
+              <w:t>8,760</w:t>
+            </w:r>
+          </w:p>
+        </w:tc>
+        <w:tc>
+          <w:tcPr>
+            <w:tcW w:type="dxa" w:w="1040"/>
+            <w:shd w:val="clear" w:color="auto" w:fill="F5F5F5"/>
+          </w:tcPr>
+          <w:p>
+            <w:pPr>
+              <w:spacing w:before="60" w:after="60"/>
+            </w:pPr>
+            <w:r>
+              <w:rPr>
+                <w:sz w:val="18"/>
+              </w:rPr>
+              <w:t>1.72</w:t>
+            </w:r>
+          </w:p>
+        </w:tc>
+        <w:tc>
+          <w:tcPr>
+            <w:tcW w:type="dxa" w:w="1040"/>
+            <w:shd w:val="clear" w:color="auto" w:fill="F5F5F5"/>
+          </w:tcPr>
+          <w:p>
+            <w:pPr>
+              <w:spacing w:before="60" w:after="60"/>
+            </w:pPr>
+            <w:r>
+              <w:rPr>
+                <w:sz w:val="18"/>
+              </w:rPr>
+              <w:t>1.04</w:t>
+            </w:r>
+          </w:p>
+        </w:tc>
+        <w:tc>
+          <w:tcPr>
+            <w:tcW w:type="dxa" w:w="1040"/>
+            <w:shd w:val="clear" w:color="auto" w:fill="F5F5F5"/>
+          </w:tcPr>
+          <w:p>
+            <w:pPr>
+              <w:spacing w:before="60" w:after="60"/>
+            </w:pPr>
+            <w:r>
+              <w:rPr>
+                <w:sz w:val="18"/>
+              </w:rPr>
+              <w:t>0.00</w:t>
+            </w:r>
+          </w:p>
+        </w:tc>
+        <w:tc>
+          <w:tcPr>
+            <w:tcW w:type="dxa" w:w="1040"/>
+            <w:shd w:val="clear" w:color="auto" w:fill="F5F5F5"/>
+          </w:tcPr>
+          <w:p>
+            <w:pPr>
+              <w:spacing w:before="60" w:after="60"/>
+            </w:pPr>
+            <w:r>
+              <w:rPr>
+                <w:sz w:val="18"/>
+              </w:rPr>
+              <w:t>0.90</w:t>
+            </w:r>
+          </w:p>
+        </w:tc>
+        <w:tc>
+          <w:tcPr>
+            <w:tcW w:type="dxa" w:w="1040"/>
+            <w:shd w:val="clear" w:color="auto" w:fill="F5F5F5"/>
+          </w:tcPr>
+          <w:p>
+            <w:pPr>
+              <w:spacing w:before="60" w:after="60"/>
+            </w:pPr>
+            <w:r>
+              <w:rPr>
+                <w:sz w:val="18"/>
+              </w:rPr>
+              <w:t>1.50</w:t>
+            </w:r>
+          </w:p>
+        </w:tc>
+        <w:tc>
+          <w:tcPr>
+            <w:tcW w:type="dxa" w:w="1040"/>
+            <w:shd w:val="clear" w:color="auto" w:fill="F5F5F5"/>
+          </w:tcPr>
+          <w:p>
+            <w:pPr>
+              <w:spacing w:before="60" w:after="60"/>
+            </w:pPr>
+            <w:r>
+              <w:rPr>
+                <w:sz w:val="18"/>
+              </w:rPr>
+              <w:t>2.30</w:t>
+            </w:r>
+          </w:p>
+        </w:tc>
+        <w:tc>
+          <w:tcPr>
+            <w:tcW w:type="dxa" w:w="1040"/>
+            <w:shd w:val="clear" w:color="auto" w:fill="F5F5F5"/>
+          </w:tcPr>
+          <w:p>
+            <w:pPr>
+              <w:spacing w:before="60" w:after="60"/>
+            </w:pPr>
+            <w:r>
+              <w:rPr>
+                <w:sz w:val="18"/>
+              </w:rPr>
+              <w:t>7.40</w:t>
+            </w:r>
+          </w:p>
+        </w:tc>
+      </w:tr>
+      <w:tr>
+        <w:tc>
+          <w:tcPr>
+            <w:tcW w:type="dxa" w:w="1040"/>
+          </w:tcPr>
+          <w:p>
+            <w:pPr>
+              <w:spacing w:before="60" w:after="60"/>
+            </w:pPr>
+            <w:r>
+              <w:rPr>
+                <w:sz w:val="18"/>
+              </w:rPr>
+              <w:t>`visibility` (10m)</w:t>
+            </w:r>
+          </w:p>
+        </w:tc>
+        <w:tc>
+          <w:tcPr>
+            <w:tcW w:type="dxa" w:w="1040"/>
+          </w:tcPr>
+          <w:p>
+            <w:pPr>
+              <w:spacing w:before="60" w:after="60"/>
+            </w:pPr>
+            <w:r>
+              <w:rPr>
+                <w:sz w:val="18"/>
+              </w:rPr>
+              <w:t>8,760</w:t>
+            </w:r>
+          </w:p>
+        </w:tc>
+        <w:tc>
+          <w:tcPr>
+            <w:tcW w:type="dxa" w:w="1040"/>
+          </w:tcPr>
+          <w:p>
+            <w:pPr>
+              <w:spacing w:before="60" w:after="60"/>
+            </w:pPr>
+            <w:r>
+              <w:rPr>
+                <w:sz w:val="18"/>
+              </w:rPr>
+              <w:t>1,436.83</w:t>
+            </w:r>
+          </w:p>
+        </w:tc>
+        <w:tc>
+          <w:tcPr>
+            <w:tcW w:type="dxa" w:w="1040"/>
+          </w:tcPr>
+          <w:p>
+            <w:pPr>
+              <w:spacing w:before="60" w:after="60"/>
+            </w:pPr>
+            <w:r>
+              <w:rPr>
+                <w:sz w:val="18"/>
+              </w:rPr>
+              <w:t>608.29</w:t>
+            </w:r>
+          </w:p>
+        </w:tc>
+        <w:tc>
+          <w:tcPr>
+            <w:tcW w:type="dxa" w:w="1040"/>
+          </w:tcPr>
+          <w:p>
+            <w:pPr>
+              <w:spacing w:before="60" w:after="60"/>
+            </w:pPr>
+            <w:r>
+              <w:rPr>
+                <w:sz w:val="18"/>
+              </w:rPr>
+              <w:t>27.00</w:t>
+            </w:r>
+          </w:p>
+        </w:tc>
+        <w:tc>
+          <w:tcPr>
+            <w:tcW w:type="dxa" w:w="1040"/>
+          </w:tcPr>
+          <w:p>
+            <w:pPr>
+              <w:spacing w:before="60" w:after="60"/>
+            </w:pPr>
+            <w:r>
+              <w:rPr>
+                <w:sz w:val="18"/>
+              </w:rPr>
+              <w:t>940.00</w:t>
+            </w:r>
+          </w:p>
+        </w:tc>
+        <w:tc>
+          <w:tcPr>
+            <w:tcW w:type="dxa" w:w="1040"/>
+          </w:tcPr>
+          <w:p>
+            <w:pPr>
+              <w:spacing w:before="60" w:after="60"/>
+            </w:pPr>
+            <w:r>
+              <w:rPr>
+                <w:sz w:val="18"/>
+              </w:rPr>
+              <w:t>1,698.00</w:t>
+            </w:r>
+          </w:p>
+        </w:tc>
+        <w:tc>
+          <w:tcPr>
+            <w:tcW w:type="dxa" w:w="1040"/>
+          </w:tcPr>
+          <w:p>
+            <w:pPr>
+              <w:spacing w:before="60" w:after="60"/>
+            </w:pPr>
+            <w:r>
+              <w:rPr>
+                <w:sz w:val="18"/>
+              </w:rPr>
+              <w:t>2,000.00</w:t>
+            </w:r>
+          </w:p>
+        </w:tc>
+        <w:tc>
+          <w:tcPr>
+            <w:tcW w:type="dxa" w:w="1040"/>
+          </w:tcPr>
+          <w:p>
+            <w:pPr>
+              <w:spacing w:before="60" w:after="60"/>
+            </w:pPr>
+            <w:r>
+              <w:rPr>
+                <w:sz w:val="18"/>
+              </w:rPr>
+              <w:t>2,000.00</w:t>
+            </w:r>
+          </w:p>
+        </w:tc>
+      </w:tr>
+      <w:tr>
+        <w:tc>
+          <w:tcPr>
+            <w:tcW w:type="dxa" w:w="1040"/>
+            <w:shd w:val="clear" w:color="auto" w:fill="F5F5F5"/>
+          </w:tcPr>
+          <w:p>
+            <w:pPr>
+              <w:spacing w:before="60" w:after="60"/>
+            </w:pPr>
+            <w:r>
+              <w:rPr>
+                <w:sz w:val="18"/>
+              </w:rPr>
+              <w:t>`solar_radiation` (MJ/m²)</w:t>
+            </w:r>
+          </w:p>
+        </w:tc>
+        <w:tc>
+          <w:tcPr>
+            <w:tcW w:type="dxa" w:w="1040"/>
+            <w:shd w:val="clear" w:color="auto" w:fill="F5F5F5"/>
+          </w:tcPr>
+          <w:p>
+            <w:pPr>
+              <w:spacing w:before="60" w:after="60"/>
+            </w:pPr>
+            <w:r>
+              <w:rPr>
+                <w:sz w:val="18"/>
+              </w:rPr>
+              <w:t>8,760</w:t>
+            </w:r>
+          </w:p>
+        </w:tc>
+        <w:tc>
+          <w:tcPr>
+            <w:tcW w:type="dxa" w:w="1040"/>
+            <w:shd w:val="clear" w:color="auto" w:fill="F5F5F5"/>
+          </w:tcPr>
+          <w:p>
+            <w:pPr>
+              <w:spacing w:before="60" w:after="60"/>
+            </w:pPr>
+            <w:r>
+              <w:rPr>
+                <w:sz w:val="18"/>
+              </w:rPr>
+              <w:t>0.57</w:t>
+            </w:r>
+          </w:p>
+        </w:tc>
+        <w:tc>
+          <w:tcPr>
+            <w:tcW w:type="dxa" w:w="1040"/>
+            <w:shd w:val="clear" w:color="auto" w:fill="F5F5F5"/>
+          </w:tcPr>
+          <w:p>
+            <w:pPr>
+              <w:spacing w:before="60" w:after="60"/>
+            </w:pPr>
+            <w:r>
+              <w:rPr>
+                <w:sz w:val="18"/>
+              </w:rPr>
+              <w:t>0.87</w:t>
+            </w:r>
+          </w:p>
+        </w:tc>
+        <w:tc>
+          <w:tcPr>
+            <w:tcW w:type="dxa" w:w="1040"/>
+            <w:shd w:val="clear" w:color="auto" w:fill="F5F5F5"/>
+          </w:tcPr>
+          <w:p>
+            <w:pPr>
+              <w:spacing w:before="60" w:after="60"/>
+            </w:pPr>
+            <w:r>
+              <w:rPr>
+                <w:sz w:val="18"/>
+              </w:rPr>
+              <w:t>0.00</w:t>
+            </w:r>
+          </w:p>
+        </w:tc>
+        <w:tc>
+          <w:tcPr>
+            <w:tcW w:type="dxa" w:w="1040"/>
+            <w:shd w:val="clear" w:color="auto" w:fill="F5F5F5"/>
+          </w:tcPr>
+          <w:p>
+            <w:pPr>
+              <w:spacing w:before="60" w:after="60"/>
+            </w:pPr>
+            <w:r>
+              <w:rPr>
+                <w:sz w:val="18"/>
+              </w:rPr>
+              <w:t>0.00</w:t>
+            </w:r>
+          </w:p>
+        </w:tc>
+        <w:tc>
+          <w:tcPr>
+            <w:tcW w:type="dxa" w:w="1040"/>
+            <w:shd w:val="clear" w:color="auto" w:fill="F5F5F5"/>
+          </w:tcPr>
+          <w:p>
+            <w:pPr>
+              <w:spacing w:before="60" w:after="60"/>
+            </w:pPr>
+            <w:r>
+              <w:rPr>
+                <w:sz w:val="18"/>
+              </w:rPr>
+              <w:t>0.01</w:t>
+            </w:r>
+          </w:p>
+        </w:tc>
+        <w:tc>
+          <w:tcPr>
+            <w:tcW w:type="dxa" w:w="1040"/>
+            <w:shd w:val="clear" w:color="auto" w:fill="F5F5F5"/>
+          </w:tcPr>
+          <w:p>
+            <w:pPr>
+              <w:spacing w:before="60" w:after="60"/>
+            </w:pPr>
+            <w:r>
+              <w:rPr>
+                <w:sz w:val="18"/>
+              </w:rPr>
+              <w:t>0.93</w:t>
+            </w:r>
+          </w:p>
+        </w:tc>
+        <w:tc>
+          <w:tcPr>
+            <w:tcW w:type="dxa" w:w="1040"/>
+            <w:shd w:val="clear" w:color="auto" w:fill="F5F5F5"/>
+          </w:tcPr>
+          <w:p>
+            <w:pPr>
+              <w:spacing w:before="60" w:after="60"/>
+            </w:pPr>
+            <w:r>
+              <w:rPr>
+                <w:sz w:val="18"/>
+              </w:rPr>
+              <w:t>3.52</w:t>
+            </w:r>
+          </w:p>
+        </w:tc>
+      </w:tr>
+      <w:tr>
+        <w:tc>
+          <w:tcPr>
+            <w:tcW w:type="dxa" w:w="1040"/>
+          </w:tcPr>
+          <w:p>
+            <w:pPr>
+              <w:spacing w:before="60" w:after="60"/>
+            </w:pPr>
+            <w:r>
+              <w:rPr>
+                <w:sz w:val="18"/>
+              </w:rPr>
+              <w:t>`rainfall` (mm)</w:t>
+            </w:r>
+          </w:p>
+        </w:tc>
+        <w:tc>
+          <w:tcPr>
+            <w:tcW w:type="dxa" w:w="1040"/>
+          </w:tcPr>
+          <w:p>
+            <w:pPr>
+              <w:spacing w:before="60" w:after="60"/>
+            </w:pPr>
+            <w:r>
+              <w:rPr>
+                <w:sz w:val="18"/>
+              </w:rPr>
+              <w:t>8,760</w:t>
+            </w:r>
+          </w:p>
+        </w:tc>
+        <w:tc>
+          <w:tcPr>
+            <w:tcW w:type="dxa" w:w="1040"/>
+          </w:tcPr>
+          <w:p>
+            <w:pPr>
+              <w:spacing w:before="60" w:after="60"/>
+            </w:pPr>
+            <w:r>
+              <w:rPr>
+                <w:sz w:val="18"/>
+              </w:rPr>
+              <w:t>0.15</w:t>
+            </w:r>
+          </w:p>
+        </w:tc>
+        <w:tc>
+          <w:tcPr>
+            <w:tcW w:type="dxa" w:w="1040"/>
+          </w:tcPr>
+          <w:p>
+            <w:pPr>
+              <w:spacing w:before="60" w:after="60"/>
+            </w:pPr>
+            <w:r>
+              <w:rPr>
+                <w:sz w:val="18"/>
+              </w:rPr>
+              <w:t>1.13</w:t>
+            </w:r>
+          </w:p>
+        </w:tc>
+        <w:tc>
+          <w:tcPr>
+            <w:tcW w:type="dxa" w:w="1040"/>
+          </w:tcPr>
+          <w:p>
+            <w:pPr>
+              <w:spacing w:before="60" w:after="60"/>
+            </w:pPr>
+            <w:r>
+              <w:rPr>
+                <w:sz w:val="18"/>
+              </w:rPr>
+              <w:t>0.00</w:t>
+            </w:r>
+          </w:p>
+        </w:tc>
+        <w:tc>
+          <w:tcPr>
+            <w:tcW w:type="dxa" w:w="1040"/>
+          </w:tcPr>
+          <w:p>
+            <w:pPr>
+              <w:spacing w:before="60" w:after="60"/>
+            </w:pPr>
+            <w:r>
+              <w:rPr>
+                <w:sz w:val="18"/>
+              </w:rPr>
+              <w:t>0.00</w:t>
+            </w:r>
+          </w:p>
+        </w:tc>
+        <w:tc>
+          <w:tcPr>
+            <w:tcW w:type="dxa" w:w="1040"/>
+          </w:tcPr>
+          <w:p>
+            <w:pPr>
+              <w:spacing w:before="60" w:after="60"/>
+            </w:pPr>
+            <w:r>
+              <w:rPr>
+                <w:sz w:val="18"/>
+              </w:rPr>
+              <w:t>0.00</w:t>
+            </w:r>
+          </w:p>
+        </w:tc>
+        <w:tc>
+          <w:tcPr>
+            <w:tcW w:type="dxa" w:w="1040"/>
+          </w:tcPr>
+          <w:p>
+            <w:pPr>
+              <w:spacing w:before="60" w:after="60"/>
+            </w:pPr>
+            <w:r>
+              <w:rPr>
+                <w:sz w:val="18"/>
+              </w:rPr>
+              <w:t>0.00</w:t>
+            </w:r>
+          </w:p>
+        </w:tc>
+        <w:tc>
+          <w:tcPr>
+            <w:tcW w:type="dxa" w:w="1040"/>
+          </w:tcPr>
+          <w:p>
+            <w:pPr>
+              <w:spacing w:before="60" w:after="60"/>
+            </w:pPr>
+            <w:r>
+              <w:rPr>
+                <w:sz w:val="18"/>
+              </w:rPr>
+              <w:t>35.00</w:t>
+            </w:r>
+          </w:p>
+        </w:tc>
+      </w:tr>
+      <w:tr>
+        <w:tc>
+          <w:tcPr>
+            <w:tcW w:type="dxa" w:w="1040"/>
+            <w:shd w:val="clear" w:color="auto" w:fill="F5F5F5"/>
+          </w:tcPr>
+          <w:p>
+            <w:pPr>
+              <w:spacing w:before="60" w:after="60"/>
+            </w:pPr>
+            <w:r>
+              <w:rPr>
+                <w:sz w:val="18"/>
+              </w:rPr>
+              <w:t>`snowfall` (cm)</w:t>
+            </w:r>
+          </w:p>
+        </w:tc>
+        <w:tc>
+          <w:tcPr>
+            <w:tcW w:type="dxa" w:w="1040"/>
+            <w:shd w:val="clear" w:color="auto" w:fill="F5F5F5"/>
+          </w:tcPr>
+          <w:p>
+            <w:pPr>
+              <w:spacing w:before="60" w:after="60"/>
+            </w:pPr>
+            <w:r>
+              <w:rPr>
+                <w:sz w:val="18"/>
+              </w:rPr>
+              <w:t>8,760</w:t>
+            </w:r>
+          </w:p>
+        </w:tc>
+        <w:tc>
+          <w:tcPr>
+            <w:tcW w:type="dxa" w:w="1040"/>
+            <w:shd w:val="clear" w:color="auto" w:fill="F5F5F5"/>
+          </w:tcPr>
+          <w:p>
+            <w:pPr>
+              <w:spacing w:before="60" w:after="60"/>
+            </w:pPr>
+            <w:r>
+              <w:rPr>
+                <w:sz w:val="18"/>
+              </w:rPr>
+              <w:t>0.08</w:t>
+            </w:r>
+          </w:p>
+        </w:tc>
+        <w:tc>
+          <w:tcPr>
+            <w:tcW w:type="dxa" w:w="1040"/>
+            <w:shd w:val="clear" w:color="auto" w:fill="F5F5F5"/>
+          </w:tcPr>
+          <w:p>
+            <w:pPr>
+              <w:spacing w:before="60" w:after="60"/>
+            </w:pPr>
+            <w:r>
+              <w:rPr>
+                <w:sz w:val="18"/>
+              </w:rPr>
+              <w:t>0.44</w:t>
+            </w:r>
+          </w:p>
+        </w:tc>
+        <w:tc>
+          <w:tcPr>
+            <w:tcW w:type="dxa" w:w="1040"/>
+            <w:shd w:val="clear" w:color="auto" w:fill="F5F5F5"/>
+          </w:tcPr>
+          <w:p>
+            <w:pPr>
+              <w:spacing w:before="60" w:after="60"/>
+            </w:pPr>
+            <w:r>
+              <w:rPr>
+                <w:sz w:val="18"/>
+              </w:rPr>
+              <w:t>0.00</w:t>
+            </w:r>
+          </w:p>
+        </w:tc>
+        <w:tc>
+          <w:tcPr>
+            <w:tcW w:type="dxa" w:w="1040"/>
+            <w:shd w:val="clear" w:color="auto" w:fill="F5F5F5"/>
+          </w:tcPr>
+          <w:p>
+            <w:pPr>
+              <w:spacing w:before="60" w:after="60"/>
+            </w:pPr>
+            <w:r>
+              <w:rPr>
+                <w:sz w:val="18"/>
+              </w:rPr>
+              <w:t>0.00</w:t>
+            </w:r>
+          </w:p>
+        </w:tc>
+        <w:tc>
+          <w:tcPr>
+            <w:tcW w:type="dxa" w:w="1040"/>
+            <w:shd w:val="clear" w:color="auto" w:fill="F5F5F5"/>
+          </w:tcPr>
+          <w:p>
+            <w:pPr>
+              <w:spacing w:before="60" w:after="60"/>
+            </w:pPr>
+            <w:r>
+              <w:rPr>
+                <w:sz w:val="18"/>
+              </w:rPr>
+              <w:t>0.00</w:t>
+            </w:r>
+          </w:p>
+        </w:tc>
+        <w:tc>
+          <w:tcPr>
+            <w:tcW w:type="dxa" w:w="1040"/>
+            <w:shd w:val="clear" w:color="auto" w:fill="F5F5F5"/>
+          </w:tcPr>
+          <w:p>
+            <w:pPr>
+              <w:spacing w:before="60" w:after="60"/>
+            </w:pPr>
+            <w:r>
+              <w:rPr>
+                <w:sz w:val="18"/>
+              </w:rPr>
+              <w:t>0.00</w:t>
+            </w:r>
+          </w:p>
+        </w:tc>
+        <w:tc>
+          <w:tcPr>
+            <w:tcW w:type="dxa" w:w="1040"/>
+            <w:shd w:val="clear" w:color="auto" w:fill="F5F5F5"/>
+          </w:tcPr>
+          <w:p>
+            <w:pPr>
+              <w:spacing w:before="60" w:after="60"/>
+            </w:pPr>
+            <w:r>
+              <w:rPr>
+                <w:sz w:val="18"/>
+              </w:rPr>
+              <w:t>8.80</w:t>
+            </w:r>
+          </w:p>
+        </w:tc>
+      </w:tr>
+    </w:tbl>
+    <w:p/>
+    <w:p>
+      <w:pPr>
+        <w:spacing w:after="80" w:line="276" w:lineRule="auto"/>
+      </w:pPr>
+      <w:r>
+        <w:t>---</w:t>
+      </w:r>
+    </w:p>
+    <w:p>
+      <w:pPr>
+        <w:pStyle w:val="Heading3"/>
+        <w:spacing w:before="160" w:after="60"/>
+      </w:pPr>
+      <w:r>
+        <w:t>B.4 Exploratory Data Analysis (EDA) &amp; Interpretations</w:t>
       </w:r>
     </w:p>
     <w:p>
@@ -2693,6 +4463,15 @@
     </w:p>
     <w:p>
       <w:pPr>
+        <w:pStyle w:val="ListBullet"/>
+        <w:spacing w:after="40"/>
+      </w:pPr>
+      <w:r>
+        <w:t>Notebook Reference: *[Refer to Notebook Cell 9 &amp; Cell 10 for EDA Code and Plots]*</w:t>
+      </w:r>
+    </w:p>
+    <w:p>
+      <w:pPr>
         <w:spacing w:after="80" w:line="276" w:lineRule="auto"/>
       </w:pPr>
       <w:r>
@@ -2717,7 +4496,7 @@
         <w:spacing w:before="160" w:after="60"/>
       </w:pPr>
       <w:r>
-        <w:t>C.1 Feature Selection Justification</w:t>
+        <w:t>C.1 Correlation Analysis &amp; Feature Selection Justification</w:t>
       </w:r>
     </w:p>
     <w:p>
@@ -2725,63 +4504,1223 @@
         <w:spacing w:after="80" w:line="276" w:lineRule="auto"/>
       </w:pPr>
       <w:r>
-        <w:t>Based on exploratory correlation and domain analysis, the final predictor space comprises:</w:t>
+        <w:t>To fulfill the rubric requirement (*"Provide justification for the selected features (you may use correlation analysis)"*), pairwise Pearson correlation coefficients were computed between each candidate predictor and the target `is_rented`:</w:t>
       </w:r>
     </w:p>
-    <w:p>
-      <w:pPr>
-        <w:pStyle w:val="ListNumber"/>
-        <w:spacing w:after="40"/>
-      </w:pPr>
-      <w:r>
-        <w:t>Continuous Meteorological Features (8): `temperature`, `humidity`, `wind_speed`, `visibility`, `solar_radiation`, `rainfall`, `snowfall`.</w:t>
-      </w:r>
-    </w:p>
-    <w:p>
-      <w:pPr>
-        <w:pStyle w:val="ListNumber"/>
-        <w:spacing w:after="40"/>
-      </w:pPr>
-      <w:r>
-        <w:t>Temporal Engineered Features (3):</w:t>
-      </w:r>
-    </w:p>
-    <w:p>
-      <w:pPr>
-        <w:pStyle w:val="ListBullet"/>
-        <w:spacing w:after="40"/>
-      </w:pPr>
-      <w:r>
-        <w:t>`month` (1 to 12): Captures macroeconomic annual seasonality.</w:t>
-      </w:r>
-    </w:p>
-    <w:p>
-      <w:pPr>
-        <w:pStyle w:val="ListBullet"/>
-        <w:spacing w:after="40"/>
-      </w:pPr>
-      <w:r>
-        <w:t>`day_of_week` (0 to 6): Accounts for weekday vs weekend travel behaviors.</w:t>
-      </w:r>
-    </w:p>
-    <w:p>
-      <w:pPr>
-        <w:pStyle w:val="ListBullet"/>
-        <w:spacing w:after="40"/>
-      </w:pPr>
-      <w:r>
-        <w:t>`is_weekend` (Binary): Distinguishes commuter travel from leisure trips.</w:t>
-      </w:r>
-    </w:p>
-    <w:p>
-      <w:pPr>
-        <w:pStyle w:val="ListNumber"/>
-        <w:spacing w:after="40"/>
-      </w:pPr>
-      <w:r>
-        <w:t>Categorical Features (2): `season` (Spring, Summer, Autumn, Winter) and `holiday` (Holiday, No Holiday).</w:t>
-      </w:r>
-    </w:p>
+    <w:tbl>
+      <w:tblPr>
+        <w:tblStyle w:val="TableGrid"/>
+        <w:tblW w:type="auto" w:w="0"/>
+        <w:jc w:val="center"/>
+        <w:tblLook w:firstColumn="1" w:firstRow="1" w:lastColumn="0" w:lastRow="0" w:noHBand="0" w:noVBand="1" w:val="04A0"/>
+      </w:tblPr>
+      <w:tblGrid>
+        <w:gridCol w:w="1872"/>
+        <w:gridCol w:w="1872"/>
+        <w:gridCol w:w="1872"/>
+        <w:gridCol w:w="1872"/>
+        <w:gridCol w:w="1872"/>
+      </w:tblGrid>
+      <w:tr>
+        <w:tc>
+          <w:tcPr>
+            <w:tcW w:type="dxa" w:w="1872"/>
+            <w:shd w:val="clear" w:color="auto" w:fill="2E7D32"/>
+          </w:tcPr>
+          <w:p>
+            <w:pPr>
+              <w:spacing w:before="60" w:after="60"/>
+            </w:pPr>
+            <w:r>
+              <w:rPr>
+                <w:b/>
+                <w:color w:val="FFFFFF"/>
+                <w:sz w:val="19"/>
+              </w:rPr>
+              <w:t>Feature Name</w:t>
+            </w:r>
+          </w:p>
+        </w:tc>
+        <w:tc>
+          <w:tcPr>
+            <w:tcW w:type="dxa" w:w="1872"/>
+            <w:shd w:val="clear" w:color="auto" w:fill="2E7D32"/>
+          </w:tcPr>
+          <w:p>
+            <w:pPr>
+              <w:spacing w:before="60" w:after="60"/>
+            </w:pPr>
+            <w:r>
+              <w:rPr>
+                <w:b/>
+                <w:color w:val="FFFFFF"/>
+                <w:sz w:val="19"/>
+              </w:rPr>
+              <w:t>Type</w:t>
+            </w:r>
+          </w:p>
+        </w:tc>
+        <w:tc>
+          <w:tcPr>
+            <w:tcW w:type="dxa" w:w="1872"/>
+            <w:shd w:val="clear" w:color="auto" w:fill="2E7D32"/>
+          </w:tcPr>
+          <w:p>
+            <w:pPr>
+              <w:spacing w:before="60" w:after="60"/>
+            </w:pPr>
+            <w:r>
+              <w:rPr>
+                <w:b/>
+                <w:color w:val="FFFFFF"/>
+                <w:sz w:val="19"/>
+              </w:rPr>
+              <w:t>Correlation with `is_rented` ($r$)</w:t>
+            </w:r>
+          </w:p>
+        </w:tc>
+        <w:tc>
+          <w:tcPr>
+            <w:tcW w:type="dxa" w:w="1872"/>
+            <w:shd w:val="clear" w:color="auto" w:fill="2E7D32"/>
+          </w:tcPr>
+          <w:p>
+            <w:pPr>
+              <w:spacing w:before="60" w:after="60"/>
+            </w:pPr>
+            <w:r>
+              <w:rPr>
+                <w:b/>
+                <w:color w:val="FFFFFF"/>
+                <w:sz w:val="19"/>
+              </w:rPr>
+              <w:t>Selection Status</w:t>
+            </w:r>
+          </w:p>
+        </w:tc>
+        <w:tc>
+          <w:tcPr>
+            <w:tcW w:type="dxa" w:w="1872"/>
+            <w:shd w:val="clear" w:color="auto" w:fill="2E7D32"/>
+          </w:tcPr>
+          <w:p>
+            <w:pPr>
+              <w:spacing w:before="60" w:after="60"/>
+            </w:pPr>
+            <w:r>
+              <w:rPr>
+                <w:b/>
+                <w:color w:val="FFFFFF"/>
+                <w:sz w:val="19"/>
+              </w:rPr>
+              <w:t>Empirical &amp; Domain Justification</w:t>
+            </w:r>
+          </w:p>
+        </w:tc>
+      </w:tr>
+      <w:tr>
+        <w:tc>
+          <w:tcPr>
+            <w:tcW w:type="dxa" w:w="1872"/>
+            <w:shd w:val="clear" w:color="auto" w:fill="F5F5F5"/>
+          </w:tcPr>
+          <w:p>
+            <w:pPr>
+              <w:spacing w:before="60" w:after="60"/>
+            </w:pPr>
+            <w:r>
+              <w:rPr>
+                <w:sz w:val="18"/>
+              </w:rPr>
+              <w:t>`temperature`</w:t>
+            </w:r>
+          </w:p>
+        </w:tc>
+        <w:tc>
+          <w:tcPr>
+            <w:tcW w:type="dxa" w:w="1872"/>
+            <w:shd w:val="clear" w:color="auto" w:fill="F5F5F5"/>
+          </w:tcPr>
+          <w:p>
+            <w:pPr>
+              <w:spacing w:before="60" w:after="60"/>
+            </w:pPr>
+            <w:r>
+              <w:rPr>
+                <w:sz w:val="18"/>
+              </w:rPr>
+              <w:t>Continuous</w:t>
+            </w:r>
+          </w:p>
+        </w:tc>
+        <w:tc>
+          <w:tcPr>
+            <w:tcW w:type="dxa" w:w="1872"/>
+            <w:shd w:val="clear" w:color="auto" w:fill="F5F5F5"/>
+          </w:tcPr>
+          <w:p>
+            <w:pPr>
+              <w:spacing w:before="60" w:after="60"/>
+            </w:pPr>
+            <w:r>
+              <w:rPr>
+                <w:sz w:val="18"/>
+              </w:rPr>
+              <w:t>$+0.2241$</w:t>
+            </w:r>
+          </w:p>
+        </w:tc>
+        <w:tc>
+          <w:tcPr>
+            <w:tcW w:type="dxa" w:w="1872"/>
+            <w:shd w:val="clear" w:color="auto" w:fill="F5F5F5"/>
+          </w:tcPr>
+          <w:p>
+            <w:pPr>
+              <w:spacing w:before="60" w:after="60"/>
+            </w:pPr>
+            <w:r>
+              <w:rPr>
+                <w:sz w:val="18"/>
+              </w:rPr>
+              <w:t>Retained</w:t>
+            </w:r>
+          </w:p>
+        </w:tc>
+        <w:tc>
+          <w:tcPr>
+            <w:tcW w:type="dxa" w:w="1872"/>
+            <w:shd w:val="clear" w:color="auto" w:fill="F5F5F5"/>
+          </w:tcPr>
+          <w:p>
+            <w:pPr>
+              <w:spacing w:before="60" w:after="60"/>
+            </w:pPr>
+            <w:r>
+              <w:rPr>
+                <w:sz w:val="18"/>
+              </w:rPr>
+              <w:t>Strongest linear environmental predictor; thermal comfort governs willingness to cycle.</w:t>
+            </w:r>
+          </w:p>
+        </w:tc>
+      </w:tr>
+      <w:tr>
+        <w:tc>
+          <w:tcPr>
+            <w:tcW w:type="dxa" w:w="1872"/>
+          </w:tcPr>
+          <w:p>
+            <w:pPr>
+              <w:spacing w:before="60" w:after="60"/>
+            </w:pPr>
+            <w:r>
+              <w:rPr>
+                <w:sz w:val="18"/>
+              </w:rPr>
+              <w:t>`solar_radiation`</w:t>
+            </w:r>
+          </w:p>
+        </w:tc>
+        <w:tc>
+          <w:tcPr>
+            <w:tcW w:type="dxa" w:w="1872"/>
+          </w:tcPr>
+          <w:p>
+            <w:pPr>
+              <w:spacing w:before="60" w:after="60"/>
+            </w:pPr>
+            <w:r>
+              <w:rPr>
+                <w:sz w:val="18"/>
+              </w:rPr>
+              <w:t>Continuous</w:t>
+            </w:r>
+          </w:p>
+        </w:tc>
+        <w:tc>
+          <w:tcPr>
+            <w:tcW w:type="dxa" w:w="1872"/>
+          </w:tcPr>
+          <w:p>
+            <w:pPr>
+              <w:spacing w:before="60" w:after="60"/>
+            </w:pPr>
+            <w:r>
+              <w:rPr>
+                <w:sz w:val="18"/>
+              </w:rPr>
+              <w:t>$+0.1245$</w:t>
+            </w:r>
+          </w:p>
+        </w:tc>
+        <w:tc>
+          <w:tcPr>
+            <w:tcW w:type="dxa" w:w="1872"/>
+          </w:tcPr>
+          <w:p>
+            <w:pPr>
+              <w:spacing w:before="60" w:after="60"/>
+            </w:pPr>
+            <w:r>
+              <w:rPr>
+                <w:sz w:val="18"/>
+              </w:rPr>
+              <w:t>Retained</w:t>
+            </w:r>
+          </w:p>
+        </w:tc>
+        <w:tc>
+          <w:tcPr>
+            <w:tcW w:type="dxa" w:w="1872"/>
+          </w:tcPr>
+          <w:p>
+            <w:pPr>
+              <w:spacing w:before="60" w:after="60"/>
+            </w:pPr>
+            <w:r>
+              <w:rPr>
+                <w:sz w:val="18"/>
+              </w:rPr>
+              <w:t>Strong proxy for daytime hours and clear, sunny conditions favorable to riding.</w:t>
+            </w:r>
+          </w:p>
+        </w:tc>
+      </w:tr>
+      <w:tr>
+        <w:tc>
+          <w:tcPr>
+            <w:tcW w:type="dxa" w:w="1872"/>
+            <w:shd w:val="clear" w:color="auto" w:fill="F5F5F5"/>
+          </w:tcPr>
+          <w:p>
+            <w:pPr>
+              <w:spacing w:before="60" w:after="60"/>
+            </w:pPr>
+            <w:r>
+              <w:rPr>
+                <w:sz w:val="18"/>
+              </w:rPr>
+              <w:t>`hour`</w:t>
+            </w:r>
+          </w:p>
+        </w:tc>
+        <w:tc>
+          <w:tcPr>
+            <w:tcW w:type="dxa" w:w="1872"/>
+            <w:shd w:val="clear" w:color="auto" w:fill="F5F5F5"/>
+          </w:tcPr>
+          <w:p>
+            <w:pPr>
+              <w:spacing w:before="60" w:after="60"/>
+            </w:pPr>
+            <w:r>
+              <w:rPr>
+                <w:sz w:val="18"/>
+              </w:rPr>
+              <w:t>Continuous</w:t>
+            </w:r>
+          </w:p>
+        </w:tc>
+        <w:tc>
+          <w:tcPr>
+            <w:tcW w:type="dxa" w:w="1872"/>
+            <w:shd w:val="clear" w:color="auto" w:fill="F5F5F5"/>
+          </w:tcPr>
+          <w:p>
+            <w:pPr>
+              <w:spacing w:before="60" w:after="60"/>
+            </w:pPr>
+            <w:r>
+              <w:rPr>
+                <w:sz w:val="18"/>
+              </w:rPr>
+              <w:t>$+0.0872$</w:t>
+            </w:r>
+          </w:p>
+        </w:tc>
+        <w:tc>
+          <w:tcPr>
+            <w:tcW w:type="dxa" w:w="1872"/>
+            <w:shd w:val="clear" w:color="auto" w:fill="F5F5F5"/>
+          </w:tcPr>
+          <w:p>
+            <w:pPr>
+              <w:spacing w:before="60" w:after="60"/>
+            </w:pPr>
+            <w:r>
+              <w:rPr>
+                <w:sz w:val="18"/>
+              </w:rPr>
+              <w:t>Retained</w:t>
+            </w:r>
+          </w:p>
+        </w:tc>
+        <w:tc>
+          <w:tcPr>
+            <w:tcW w:type="dxa" w:w="1872"/>
+            <w:shd w:val="clear" w:color="auto" w:fill="F5F5F5"/>
+          </w:tcPr>
+          <w:p>
+            <w:pPr>
+              <w:spacing w:before="60" w:after="60"/>
+            </w:pPr>
+            <w:r>
+              <w:rPr>
+                <w:sz w:val="18"/>
+              </w:rPr>
+              <w:t>Captures the diurnal circadian cycle and peak commuter traffic periods (8 AM, 6 PM).</w:t>
+            </w:r>
+          </w:p>
+        </w:tc>
+      </w:tr>
+      <w:tr>
+        <w:tc>
+          <w:tcPr>
+            <w:tcW w:type="dxa" w:w="1872"/>
+          </w:tcPr>
+          <w:p>
+            <w:pPr>
+              <w:spacing w:before="60" w:after="60"/>
+            </w:pPr>
+            <w:r>
+              <w:rPr>
+                <w:sz w:val="18"/>
+              </w:rPr>
+              <w:t>`wind_speed`</w:t>
+            </w:r>
+          </w:p>
+        </w:tc>
+        <w:tc>
+          <w:tcPr>
+            <w:tcW w:type="dxa" w:w="1872"/>
+          </w:tcPr>
+          <w:p>
+            <w:pPr>
+              <w:spacing w:before="60" w:after="60"/>
+            </w:pPr>
+            <w:r>
+              <w:rPr>
+                <w:sz w:val="18"/>
+              </w:rPr>
+              <w:t>Continuous</w:t>
+            </w:r>
+          </w:p>
+        </w:tc>
+        <w:tc>
+          <w:tcPr>
+            <w:tcW w:type="dxa" w:w="1872"/>
+          </w:tcPr>
+          <w:p>
+            <w:pPr>
+              <w:spacing w:before="60" w:after="60"/>
+            </w:pPr>
+            <w:r>
+              <w:rPr>
+                <w:sz w:val="18"/>
+              </w:rPr>
+              <w:t>$+0.0452$</w:t>
+            </w:r>
+          </w:p>
+        </w:tc>
+        <w:tc>
+          <w:tcPr>
+            <w:tcW w:type="dxa" w:w="1872"/>
+          </w:tcPr>
+          <w:p>
+            <w:pPr>
+              <w:spacing w:before="60" w:after="60"/>
+            </w:pPr>
+            <w:r>
+              <w:rPr>
+                <w:sz w:val="18"/>
+              </w:rPr>
+              <w:t>Retained</w:t>
+            </w:r>
+          </w:p>
+        </w:tc>
+        <w:tc>
+          <w:tcPr>
+            <w:tcW w:type="dxa" w:w="1872"/>
+          </w:tcPr>
+          <w:p>
+            <w:pPr>
+              <w:spacing w:before="60" w:after="60"/>
+            </w:pPr>
+            <w:r>
+              <w:rPr>
+                <w:sz w:val="18"/>
+              </w:rPr>
+              <w:t>Moderate wind levels associate with clear, non-stagnant weather.</w:t>
+            </w:r>
+          </w:p>
+        </w:tc>
+      </w:tr>
+      <w:tr>
+        <w:tc>
+          <w:tcPr>
+            <w:tcW w:type="dxa" w:w="1872"/>
+            <w:shd w:val="clear" w:color="auto" w:fill="F5F5F5"/>
+          </w:tcPr>
+          <w:p>
+            <w:pPr>
+              <w:spacing w:before="60" w:after="60"/>
+            </w:pPr>
+            <w:r>
+              <w:rPr>
+                <w:sz w:val="18"/>
+              </w:rPr>
+              <w:t>`visibility`</w:t>
+            </w:r>
+          </w:p>
+        </w:tc>
+        <w:tc>
+          <w:tcPr>
+            <w:tcW w:type="dxa" w:w="1872"/>
+            <w:shd w:val="clear" w:color="auto" w:fill="F5F5F5"/>
+          </w:tcPr>
+          <w:p>
+            <w:pPr>
+              <w:spacing w:before="60" w:after="60"/>
+            </w:pPr>
+            <w:r>
+              <w:rPr>
+                <w:sz w:val="18"/>
+              </w:rPr>
+              <w:t>Continuous</w:t>
+            </w:r>
+          </w:p>
+        </w:tc>
+        <w:tc>
+          <w:tcPr>
+            <w:tcW w:type="dxa" w:w="1872"/>
+            <w:shd w:val="clear" w:color="auto" w:fill="F5F5F5"/>
+          </w:tcPr>
+          <w:p>
+            <w:pPr>
+              <w:spacing w:before="60" w:after="60"/>
+            </w:pPr>
+            <w:r>
+              <w:rPr>
+                <w:sz w:val="18"/>
+              </w:rPr>
+              <w:t>$+0.0382$</w:t>
+            </w:r>
+          </w:p>
+        </w:tc>
+        <w:tc>
+          <w:tcPr>
+            <w:tcW w:type="dxa" w:w="1872"/>
+            <w:shd w:val="clear" w:color="auto" w:fill="F5F5F5"/>
+          </w:tcPr>
+          <w:p>
+            <w:pPr>
+              <w:spacing w:before="60" w:after="60"/>
+            </w:pPr>
+            <w:r>
+              <w:rPr>
+                <w:sz w:val="18"/>
+              </w:rPr>
+              <w:t>Retained</w:t>
+            </w:r>
+          </w:p>
+        </w:tc>
+        <w:tc>
+          <w:tcPr>
+            <w:tcW w:type="dxa" w:w="1872"/>
+            <w:shd w:val="clear" w:color="auto" w:fill="F5F5F5"/>
+          </w:tcPr>
+          <w:p>
+            <w:pPr>
+              <w:spacing w:before="60" w:after="60"/>
+            </w:pPr>
+            <w:r>
+              <w:rPr>
+                <w:sz w:val="18"/>
+              </w:rPr>
+              <w:t>Determines road safety and cyclist navigation comfort during poor weather.</w:t>
+            </w:r>
+          </w:p>
+        </w:tc>
+      </w:tr>
+      <w:tr>
+        <w:tc>
+          <w:tcPr>
+            <w:tcW w:type="dxa" w:w="1872"/>
+          </w:tcPr>
+          <w:p>
+            <w:pPr>
+              <w:spacing w:before="60" w:after="60"/>
+            </w:pPr>
+            <w:r>
+              <w:rPr>
+                <w:sz w:val="18"/>
+              </w:rPr>
+              <w:t>`month`</w:t>
+            </w:r>
+          </w:p>
+        </w:tc>
+        <w:tc>
+          <w:tcPr>
+            <w:tcW w:type="dxa" w:w="1872"/>
+          </w:tcPr>
+          <w:p>
+            <w:pPr>
+              <w:spacing w:before="60" w:after="60"/>
+            </w:pPr>
+            <w:r>
+              <w:rPr>
+                <w:sz w:val="18"/>
+              </w:rPr>
+              <w:t>Continuous</w:t>
+            </w:r>
+          </w:p>
+        </w:tc>
+        <w:tc>
+          <w:tcPr>
+            <w:tcW w:type="dxa" w:w="1872"/>
+          </w:tcPr>
+          <w:p>
+            <w:pPr>
+              <w:spacing w:before="60" w:after="60"/>
+            </w:pPr>
+            <w:r>
+              <w:rPr>
+                <w:sz w:val="18"/>
+              </w:rPr>
+              <w:t>$-0.0152$</w:t>
+            </w:r>
+          </w:p>
+        </w:tc>
+        <w:tc>
+          <w:tcPr>
+            <w:tcW w:type="dxa" w:w="1872"/>
+          </w:tcPr>
+          <w:p>
+            <w:pPr>
+              <w:spacing w:before="60" w:after="60"/>
+            </w:pPr>
+            <w:r>
+              <w:rPr>
+                <w:sz w:val="18"/>
+              </w:rPr>
+              <w:t>Retained</w:t>
+            </w:r>
+          </w:p>
+        </w:tc>
+        <w:tc>
+          <w:tcPr>
+            <w:tcW w:type="dxa" w:w="1872"/>
+          </w:tcPr>
+          <w:p>
+            <w:pPr>
+              <w:spacing w:before="60" w:after="60"/>
+            </w:pPr>
+            <w:r>
+              <w:rPr>
+                <w:sz w:val="18"/>
+              </w:rPr>
+              <w:t>Captures macro-level annual seasonality, daylight variations, and school/work sessions.</w:t>
+            </w:r>
+          </w:p>
+        </w:tc>
+      </w:tr>
+      <w:tr>
+        <w:tc>
+          <w:tcPr>
+            <w:tcW w:type="dxa" w:w="1872"/>
+            <w:shd w:val="clear" w:color="auto" w:fill="F5F5F5"/>
+          </w:tcPr>
+          <w:p>
+            <w:pPr>
+              <w:spacing w:before="60" w:after="60"/>
+            </w:pPr>
+            <w:r>
+              <w:rPr>
+                <w:sz w:val="18"/>
+              </w:rPr>
+              <w:t>`day_of_week`</w:t>
+            </w:r>
+          </w:p>
+        </w:tc>
+        <w:tc>
+          <w:tcPr>
+            <w:tcW w:type="dxa" w:w="1872"/>
+            <w:shd w:val="clear" w:color="auto" w:fill="F5F5F5"/>
+          </w:tcPr>
+          <w:p>
+            <w:pPr>
+              <w:spacing w:before="60" w:after="60"/>
+            </w:pPr>
+            <w:r>
+              <w:rPr>
+                <w:sz w:val="18"/>
+              </w:rPr>
+              <w:t>Continuous</w:t>
+            </w:r>
+          </w:p>
+        </w:tc>
+        <w:tc>
+          <w:tcPr>
+            <w:tcW w:type="dxa" w:w="1872"/>
+            <w:shd w:val="clear" w:color="auto" w:fill="F5F5F5"/>
+          </w:tcPr>
+          <w:p>
+            <w:pPr>
+              <w:spacing w:before="60" w:after="60"/>
+            </w:pPr>
+            <w:r>
+              <w:rPr>
+                <w:sz w:val="18"/>
+              </w:rPr>
+              <w:t>$+0.0135$</w:t>
+            </w:r>
+          </w:p>
+        </w:tc>
+        <w:tc>
+          <w:tcPr>
+            <w:tcW w:type="dxa" w:w="1872"/>
+            <w:shd w:val="clear" w:color="auto" w:fill="F5F5F5"/>
+          </w:tcPr>
+          <w:p>
+            <w:pPr>
+              <w:spacing w:before="60" w:after="60"/>
+            </w:pPr>
+            <w:r>
+              <w:rPr>
+                <w:sz w:val="18"/>
+              </w:rPr>
+              <w:t>Retained</w:t>
+            </w:r>
+          </w:p>
+        </w:tc>
+        <w:tc>
+          <w:tcPr>
+            <w:tcW w:type="dxa" w:w="1872"/>
+            <w:shd w:val="clear" w:color="auto" w:fill="F5F5F5"/>
+          </w:tcPr>
+          <w:p>
+            <w:pPr>
+              <w:spacing w:before="60" w:after="60"/>
+            </w:pPr>
+            <w:r>
+              <w:rPr>
+                <w:sz w:val="18"/>
+              </w:rPr>
+              <w:t>Captures the weekly cycle, distinguishing weekday commutes from weekend leisure.</w:t>
+            </w:r>
+          </w:p>
+        </w:tc>
+      </w:tr>
+      <w:tr>
+        <w:tc>
+          <w:tcPr>
+            <w:tcW w:type="dxa" w:w="1872"/>
+          </w:tcPr>
+          <w:p>
+            <w:pPr>
+              <w:spacing w:before="60" w:after="60"/>
+            </w:pPr>
+            <w:r>
+              <w:rPr>
+                <w:sz w:val="18"/>
+              </w:rPr>
+              <w:t>`is_weekend`</w:t>
+            </w:r>
+          </w:p>
+        </w:tc>
+        <w:tc>
+          <w:tcPr>
+            <w:tcW w:type="dxa" w:w="1872"/>
+          </w:tcPr>
+          <w:p>
+            <w:pPr>
+              <w:spacing w:before="60" w:after="60"/>
+            </w:pPr>
+            <w:r>
+              <w:rPr>
+                <w:sz w:val="18"/>
+              </w:rPr>
+              <w:t>Binary</w:t>
+            </w:r>
+          </w:p>
+        </w:tc>
+        <w:tc>
+          <w:tcPr>
+            <w:tcW w:type="dxa" w:w="1872"/>
+          </w:tcPr>
+          <w:p>
+            <w:pPr>
+              <w:spacing w:before="60" w:after="60"/>
+            </w:pPr>
+            <w:r>
+              <w:rPr>
+                <w:sz w:val="18"/>
+              </w:rPr>
+              <w:t>$+0.0094$</w:t>
+            </w:r>
+          </w:p>
+        </w:tc>
+        <w:tc>
+          <w:tcPr>
+            <w:tcW w:type="dxa" w:w="1872"/>
+          </w:tcPr>
+          <w:p>
+            <w:pPr>
+              <w:spacing w:before="60" w:after="60"/>
+            </w:pPr>
+            <w:r>
+              <w:rPr>
+                <w:sz w:val="18"/>
+              </w:rPr>
+              <w:t>Retained</w:t>
+            </w:r>
+          </w:p>
+        </w:tc>
+        <w:tc>
+          <w:tcPr>
+            <w:tcW w:type="dxa" w:w="1872"/>
+          </w:tcPr>
+          <w:p>
+            <w:pPr>
+              <w:spacing w:before="60" w:after="60"/>
+            </w:pPr>
+            <w:r>
+              <w:rPr>
+                <w:sz w:val="18"/>
+              </w:rPr>
+              <w:t>Directly separates weekend commuter dynamics from regular working weekdays.</w:t>
+            </w:r>
+          </w:p>
+        </w:tc>
+      </w:tr>
+      <w:tr>
+        <w:tc>
+          <w:tcPr>
+            <w:tcW w:type="dxa" w:w="1872"/>
+            <w:shd w:val="clear" w:color="auto" w:fill="F5F5F5"/>
+          </w:tcPr>
+          <w:p>
+            <w:pPr>
+              <w:spacing w:before="60" w:after="60"/>
+            </w:pPr>
+            <w:r>
+              <w:rPr>
+                <w:sz w:val="18"/>
+              </w:rPr>
+              <w:t>`rainfall`</w:t>
+            </w:r>
+          </w:p>
+        </w:tc>
+        <w:tc>
+          <w:tcPr>
+            <w:tcW w:type="dxa" w:w="1872"/>
+            <w:shd w:val="clear" w:color="auto" w:fill="F5F5F5"/>
+          </w:tcPr>
+          <w:p>
+            <w:pPr>
+              <w:spacing w:before="60" w:after="60"/>
+            </w:pPr>
+            <w:r>
+              <w:rPr>
+                <w:sz w:val="18"/>
+              </w:rPr>
+              <w:t>Continuous</w:t>
+            </w:r>
+          </w:p>
+        </w:tc>
+        <w:tc>
+          <w:tcPr>
+            <w:tcW w:type="dxa" w:w="1872"/>
+            <w:shd w:val="clear" w:color="auto" w:fill="F5F5F5"/>
+          </w:tcPr>
+          <w:p>
+            <w:pPr>
+              <w:spacing w:before="60" w:after="60"/>
+            </w:pPr>
+            <w:r>
+              <w:rPr>
+                <w:sz w:val="18"/>
+              </w:rPr>
+              <w:t>$-0.0718$</w:t>
+            </w:r>
+          </w:p>
+        </w:tc>
+        <w:tc>
+          <w:tcPr>
+            <w:tcW w:type="dxa" w:w="1872"/>
+            <w:shd w:val="clear" w:color="auto" w:fill="F5F5F5"/>
+          </w:tcPr>
+          <w:p>
+            <w:pPr>
+              <w:spacing w:before="60" w:after="60"/>
+            </w:pPr>
+            <w:r>
+              <w:rPr>
+                <w:sz w:val="18"/>
+              </w:rPr>
+              <w:t>Retained</w:t>
+            </w:r>
+          </w:p>
+        </w:tc>
+        <w:tc>
+          <w:tcPr>
+            <w:tcW w:type="dxa" w:w="1872"/>
+            <w:shd w:val="clear" w:color="auto" w:fill="F5F5F5"/>
+          </w:tcPr>
+          <w:p>
+            <w:pPr>
+              <w:spacing w:before="60" w:after="60"/>
+            </w:pPr>
+            <w:r>
+              <w:rPr>
+                <w:sz w:val="18"/>
+              </w:rPr>
+              <w:t>Precipitation causes physical road hazards and immediately suppresses demand.</w:t>
+            </w:r>
+          </w:p>
+        </w:tc>
+      </w:tr>
+      <w:tr>
+        <w:tc>
+          <w:tcPr>
+            <w:tcW w:type="dxa" w:w="1872"/>
+          </w:tcPr>
+          <w:p>
+            <w:pPr>
+              <w:spacing w:before="60" w:after="60"/>
+            </w:pPr>
+            <w:r>
+              <w:rPr>
+                <w:sz w:val="18"/>
+              </w:rPr>
+              <w:t>`snowfall`</w:t>
+            </w:r>
+          </w:p>
+        </w:tc>
+        <w:tc>
+          <w:tcPr>
+            <w:tcW w:type="dxa" w:w="1872"/>
+          </w:tcPr>
+          <w:p>
+            <w:pPr>
+              <w:spacing w:before="60" w:after="60"/>
+            </w:pPr>
+            <w:r>
+              <w:rPr>
+                <w:sz w:val="18"/>
+              </w:rPr>
+              <w:t>Continuous</w:t>
+            </w:r>
+          </w:p>
+        </w:tc>
+        <w:tc>
+          <w:tcPr>
+            <w:tcW w:type="dxa" w:w="1872"/>
+          </w:tcPr>
+          <w:p>
+            <w:pPr>
+              <w:spacing w:before="60" w:after="60"/>
+            </w:pPr>
+            <w:r>
+              <w:rPr>
+                <w:sz w:val="18"/>
+              </w:rPr>
+              <w:t>$-0.0421$</w:t>
+            </w:r>
+          </w:p>
+        </w:tc>
+        <w:tc>
+          <w:tcPr>
+            <w:tcW w:type="dxa" w:w="1872"/>
+          </w:tcPr>
+          <w:p>
+            <w:pPr>
+              <w:spacing w:before="60" w:after="60"/>
+            </w:pPr>
+            <w:r>
+              <w:rPr>
+                <w:sz w:val="18"/>
+              </w:rPr>
+              <w:t>Retained</w:t>
+            </w:r>
+          </w:p>
+        </w:tc>
+        <w:tc>
+          <w:tcPr>
+            <w:tcW w:type="dxa" w:w="1872"/>
+          </w:tcPr>
+          <w:p>
+            <w:pPr>
+              <w:spacing w:before="60" w:after="60"/>
+            </w:pPr>
+            <w:r>
+              <w:rPr>
+                <w:sz w:val="18"/>
+              </w:rPr>
+              <w:t>Freezing precipitation and icy conditions create severe cycling deterrence.</w:t>
+            </w:r>
+          </w:p>
+        </w:tc>
+      </w:tr>
+      <w:tr>
+        <w:tc>
+          <w:tcPr>
+            <w:tcW w:type="dxa" w:w="1872"/>
+            <w:shd w:val="clear" w:color="auto" w:fill="F5F5F5"/>
+          </w:tcPr>
+          <w:p>
+            <w:pPr>
+              <w:spacing w:before="60" w:after="60"/>
+            </w:pPr>
+            <w:r>
+              <w:rPr>
+                <w:sz w:val="18"/>
+              </w:rPr>
+              <w:t>`humidity`</w:t>
+            </w:r>
+          </w:p>
+        </w:tc>
+        <w:tc>
+          <w:tcPr>
+            <w:tcW w:type="dxa" w:w="1872"/>
+            <w:shd w:val="clear" w:color="auto" w:fill="F5F5F5"/>
+          </w:tcPr>
+          <w:p>
+            <w:pPr>
+              <w:spacing w:before="60" w:after="60"/>
+            </w:pPr>
+            <w:r>
+              <w:rPr>
+                <w:sz w:val="18"/>
+              </w:rPr>
+              <w:t>Continuous</w:t>
+            </w:r>
+          </w:p>
+        </w:tc>
+        <w:tc>
+          <w:tcPr>
+            <w:tcW w:type="dxa" w:w="1872"/>
+            <w:shd w:val="clear" w:color="auto" w:fill="F5F5F5"/>
+          </w:tcPr>
+          <w:p>
+            <w:pPr>
+              <w:spacing w:before="60" w:after="60"/>
+            </w:pPr>
+            <w:r>
+              <w:rPr>
+                <w:sz w:val="18"/>
+              </w:rPr>
+              <w:t>$-0.0543$</w:t>
+            </w:r>
+          </w:p>
+        </w:tc>
+        <w:tc>
+          <w:tcPr>
+            <w:tcW w:type="dxa" w:w="1872"/>
+            <w:shd w:val="clear" w:color="auto" w:fill="F5F5F5"/>
+          </w:tcPr>
+          <w:p>
+            <w:pPr>
+              <w:spacing w:before="60" w:after="60"/>
+            </w:pPr>
+            <w:r>
+              <w:rPr>
+                <w:sz w:val="18"/>
+              </w:rPr>
+              <w:t>Retained</w:t>
+            </w:r>
+          </w:p>
+        </w:tc>
+        <w:tc>
+          <w:tcPr>
+            <w:tcW w:type="dxa" w:w="1872"/>
+            <w:shd w:val="clear" w:color="auto" w:fill="F5F5F5"/>
+          </w:tcPr>
+          <w:p>
+            <w:pPr>
+              <w:spacing w:before="60" w:after="60"/>
+            </w:pPr>
+            <w:r>
+              <w:rPr>
+                <w:sz w:val="18"/>
+              </w:rPr>
+              <w:t>High humidity correlates with precipitation, oppressive heat, or fog.</w:t>
+            </w:r>
+          </w:p>
+        </w:tc>
+      </w:tr>
+      <w:tr>
+        <w:tc>
+          <w:tcPr>
+            <w:tcW w:type="dxa" w:w="1872"/>
+          </w:tcPr>
+          <w:p>
+            <w:pPr>
+              <w:spacing w:before="60" w:after="60"/>
+            </w:pPr>
+            <w:r>
+              <w:rPr>
+                <w:sz w:val="18"/>
+              </w:rPr>
+              <w:t>`season`</w:t>
+            </w:r>
+          </w:p>
+        </w:tc>
+        <w:tc>
+          <w:tcPr>
+            <w:tcW w:type="dxa" w:w="1872"/>
+          </w:tcPr>
+          <w:p>
+            <w:pPr>
+              <w:spacing w:before="60" w:after="60"/>
+            </w:pPr>
+            <w:r>
+              <w:rPr>
+                <w:sz w:val="18"/>
+              </w:rPr>
+              <w:t>Categorical</w:t>
+            </w:r>
+          </w:p>
+        </w:tc>
+        <w:tc>
+          <w:tcPr>
+            <w:tcW w:type="dxa" w:w="1872"/>
+          </w:tcPr>
+          <w:p>
+            <w:pPr>
+              <w:spacing w:before="60" w:after="60"/>
+            </w:pPr>
+            <w:r>
+              <w:rPr>
+                <w:sz w:val="18"/>
+              </w:rPr>
+              <w:t>N/A (One-Hot)</w:t>
+            </w:r>
+          </w:p>
+        </w:tc>
+        <w:tc>
+          <w:tcPr>
+            <w:tcW w:type="dxa" w:w="1872"/>
+          </w:tcPr>
+          <w:p>
+            <w:pPr>
+              <w:spacing w:before="60" w:after="60"/>
+            </w:pPr>
+            <w:r>
+              <w:rPr>
+                <w:sz w:val="18"/>
+              </w:rPr>
+              <w:t>Retained</w:t>
+            </w:r>
+          </w:p>
+        </w:tc>
+        <w:tc>
+          <w:tcPr>
+            <w:tcW w:type="dxa" w:w="1872"/>
+          </w:tcPr>
+          <w:p>
+            <w:pPr>
+              <w:spacing w:before="60" w:after="60"/>
+            </w:pPr>
+            <w:r>
+              <w:rPr>
+                <w:sz w:val="18"/>
+              </w:rPr>
+              <w:t>Captures distinct meteorological regimes (Spring, Summer, Autumn, Winter).</w:t>
+            </w:r>
+          </w:p>
+        </w:tc>
+      </w:tr>
+      <w:tr>
+        <w:tc>
+          <w:tcPr>
+            <w:tcW w:type="dxa" w:w="1872"/>
+            <w:shd w:val="clear" w:color="auto" w:fill="F5F5F5"/>
+          </w:tcPr>
+          <w:p>
+            <w:pPr>
+              <w:spacing w:before="60" w:after="60"/>
+            </w:pPr>
+            <w:r>
+              <w:rPr>
+                <w:sz w:val="18"/>
+              </w:rPr>
+              <w:t>`holiday`</w:t>
+            </w:r>
+          </w:p>
+        </w:tc>
+        <w:tc>
+          <w:tcPr>
+            <w:tcW w:type="dxa" w:w="1872"/>
+            <w:shd w:val="clear" w:color="auto" w:fill="F5F5F5"/>
+          </w:tcPr>
+          <w:p>
+            <w:pPr>
+              <w:spacing w:before="60" w:after="60"/>
+            </w:pPr>
+            <w:r>
+              <w:rPr>
+                <w:sz w:val="18"/>
+              </w:rPr>
+              <w:t>Categorical</w:t>
+            </w:r>
+          </w:p>
+        </w:tc>
+        <w:tc>
+          <w:tcPr>
+            <w:tcW w:type="dxa" w:w="1872"/>
+            <w:shd w:val="clear" w:color="auto" w:fill="F5F5F5"/>
+          </w:tcPr>
+          <w:p>
+            <w:pPr>
+              <w:spacing w:before="60" w:after="60"/>
+            </w:pPr>
+            <w:r>
+              <w:rPr>
+                <w:sz w:val="18"/>
+              </w:rPr>
+              <w:t>N/A (One-Hot)</w:t>
+            </w:r>
+          </w:p>
+        </w:tc>
+        <w:tc>
+          <w:tcPr>
+            <w:tcW w:type="dxa" w:w="1872"/>
+            <w:shd w:val="clear" w:color="auto" w:fill="F5F5F5"/>
+          </w:tcPr>
+          <w:p>
+            <w:pPr>
+              <w:spacing w:before="60" w:after="60"/>
+            </w:pPr>
+            <w:r>
+              <w:rPr>
+                <w:sz w:val="18"/>
+              </w:rPr>
+              <w:t>Retained</w:t>
+            </w:r>
+          </w:p>
+        </w:tc>
+        <w:tc>
+          <w:tcPr>
+            <w:tcW w:type="dxa" w:w="1872"/>
+            <w:shd w:val="clear" w:color="auto" w:fill="F5F5F5"/>
+          </w:tcPr>
+          <w:p>
+            <w:pPr>
+              <w:spacing w:before="60" w:after="60"/>
+            </w:pPr>
+            <w:r>
+              <w:rPr>
+                <w:sz w:val="18"/>
+              </w:rPr>
+              <w:t>Distinguishes public holiday leisure usage from standard working-day commutes.</w:t>
+            </w:r>
+          </w:p>
+        </w:tc>
+      </w:tr>
+    </w:tbl>
+    <w:p/>
     <w:p>
       <w:pPr>
         <w:pStyle w:val="Heading3"/>
@@ -2815,7 +5754,7 @@
         <w:spacing w:after="40"/>
       </w:pPr>
       <w:r>
-        <w:t>`date`: Excluded in favor of parsed numerical temporal features (`month`, `day_of_week`).</w:t>
+        <w:t>`date`: Excluded in favor of parsed numerical temporal features (`month`, `day_of_week`, `is_weekend`).</w:t>
       </w:r>
     </w:p>
     <w:p>
@@ -2829,6 +5768,15 @@
     </w:p>
     <w:p>
       <w:pPr>
+        <w:pStyle w:val="ListBullet"/>
+        <w:spacing w:after="40"/>
+      </w:pPr>
+      <w:r>
+        <w:t>Notebook Reference: *[Refer to Notebook Cell 11 &amp; Cell 13 for Feature Selection Code]*</w:t>
+      </w:r>
+    </w:p>
+    <w:p>
+      <w:pPr>
         <w:spacing w:after="80" w:line="276" w:lineRule="auto"/>
       </w:pPr>
       <w:r>
@@ -2844,7 +5792,7 @@
         <w:rPr>
           <w:color w:val="212121"/>
         </w:rPr>
-        <w:t>Section D: Data Splitting &amp; Leak-Free Pipeline</w:t>
+        <w:t>Section D: Data Splitting &amp; Leakage-Free Preprocessing Pipeline</w:t>
       </w:r>
     </w:p>
     <w:p>
@@ -2853,7 +5801,7 @@
         <w:spacing w:before="160" w:after="60"/>
       </w:pPr>
       <w:r>
-        <w:t>D.1 Splitting Value and Stratification Protocol</w:t>
+        <w:t>D.1 Splitting Protocol and Stratification</w:t>
       </w:r>
     </w:p>
     <w:p>
@@ -2861,7 +5809,7 @@
         <w:spacing w:after="80" w:line="276" w:lineRule="auto"/>
       </w:pPr>
       <w:r>
-        <w:t>To satisfy requirement #3 of the project syllabus:</w:t>
+        <w:t>To satisfy Requirement #3 of the project syllabus (*"Train the model using 80-20 split with 42 as the random_state value, if applicable"*):</w:t>
       </w:r>
     </w:p>
     <w:p>
@@ -3345,7 +6293,7 @@
         <w:spacing w:before="160" w:after="60"/>
       </w:pPr>
       <w:r>
-        <w:t>D.2 Strict Leakage-Free Preprocessing Pipeline</w:t>
+        <w:t>D.2 Strict Leakage-Free Preprocessing Pipeline Architecture</w:t>
       </w:r>
     </w:p>
     <w:p>
@@ -3362,7 +6310,15 @@
         <w:spacing w:after="40"/>
       </w:pPr>
       <w:r>
-        <w:t>Numerical Transformer: `StandardScaler()` scales features to zero mean and unit variance.</w:t>
+        <w:t>Numerical Transformer: `StandardScaler()` scales continuous features to zero mean and unit variance:</w:t>
+      </w:r>
+    </w:p>
+    <w:p>
+      <w:pPr>
+        <w:spacing w:after="80" w:line="276" w:lineRule="auto"/>
+      </w:pPr>
+      <w:r>
+        <w:t>$$z = \frac{x - \mu_{\text{train}}}{\sigma_{\text{train}}}$$</w:t>
       </w:r>
     </w:p>
     <w:p>
@@ -3380,7 +6336,16 @@
         <w:spacing w:after="40"/>
       </w:pPr>
       <w:r>
-        <w:t>Execution Rule: The transformer is fitted exclusively on `X_train` (`preprocessor.fit(X_train)`), and applied to `X_test` via `.transform()`. This eliminates data leakage across partitions.</w:t>
+        <w:t>Leakage-Free Execution Rule: The preprocessor is fitted exclusively on `X_train` (`preprocessor.fit(X_train)`), and applied to `X_test` via `.transform()`. This prevents test data statistics from leaking into model weights.</w:t>
+      </w:r>
+    </w:p>
+    <w:p>
+      <w:pPr>
+        <w:pStyle w:val="ListBullet"/>
+        <w:spacing w:after="40"/>
+      </w:pPr>
+      <w:r>
+        <w:t>Notebook Reference: *[Refer to Notebook Cell 12 &amp; Cell 13 for Train/Test Splitting and Preprocessor Code]*</w:t>
       </w:r>
     </w:p>
     <w:p>
@@ -3409,7 +6374,7 @@
         <w:spacing w:before="160" w:after="60"/>
       </w:pPr>
       <w:r>
-        <w:t>E.1 Algorithm Selection and Rationale</w:t>
+        <w:t>E.1 Algorithm Selection and Theoretical Rationale</w:t>
       </w:r>
     </w:p>
     <w:p>
@@ -3986,6 +6951,15 @@
     </w:p>
     <w:p>
       <w:pPr>
+        <w:pStyle w:val="ListBullet"/>
+        <w:spacing w:after="40"/>
+      </w:pPr>
+      <w:r>
+        <w:t>Notebook Reference: *[Refer to Notebook Cell 14 &amp; Cell 15 for Model Initialization and 5-Fold Cross-Validation Code]*</w:t>
+      </w:r>
+    </w:p>
+    <w:p>
+      <w:pPr>
         <w:spacing w:after="80" w:line="276" w:lineRule="auto"/>
       </w:pPr>
       <w:r>
@@ -4001,7 +6975,7 @@
         <w:rPr>
           <w:color w:val="212121"/>
         </w:rPr>
-        <w:t>Section F: Model Evaluation &amp; Interpretation</w:t>
+        <w:t>Section F: Model Evaluation, Confusion Matrices &amp; Error Analysis</w:t>
       </w:r>
     </w:p>
     <w:p>
@@ -5331,7 +8305,134 @@
         <w:spacing w:before="160" w:after="60"/>
       </w:pPr>
       <w:r>
-        <w:t>F.2 Confusion Matrix Visual Breakdown</w:t>
+        <w:t>F.2 Mathematical Metric Definitions</w:t>
+      </w:r>
+    </w:p>
+    <w:p>
+      <w:pPr>
+        <w:spacing w:after="80" w:line="276" w:lineRule="auto"/>
+      </w:pPr>
+      <w:r>
+        <w:t>To provide full mathematical rigor:</w:t>
+      </w:r>
+    </w:p>
+    <w:p>
+      <w:pPr>
+        <w:pStyle w:val="ListNumber"/>
+        <w:spacing w:after="40"/>
+      </w:pPr>
+      <w:r>
+        <w:t>Raw Accuracy:</w:t>
+      </w:r>
+    </w:p>
+    <w:p>
+      <w:pPr>
+        <w:spacing w:after="80" w:line="276" w:lineRule="auto"/>
+      </w:pPr>
+      <w:r>
+        <w:t>$$\text{Accuracy} = \frac{\text{TP} + \text{TN}}{\text{TP} + \text{TN} + \text{FP} + \text{FN}}$$</w:t>
+      </w:r>
+    </w:p>
+    <w:p>
+      <w:pPr>
+        <w:pStyle w:val="ListNumber"/>
+        <w:spacing w:after="40"/>
+      </w:pPr>
+      <w:r>
+        <w:t>Balanced Accuracy:</w:t>
+      </w:r>
+    </w:p>
+    <w:p>
+      <w:pPr>
+        <w:spacing w:after="80" w:line="276" w:lineRule="auto"/>
+      </w:pPr>
+      <w:r>
+        <w:t>$$\text{Balanced Accuracy} = \frac{\text{Sensitivity} + \text{Specificity}}{2} = \frac{1}{2}\left(\frac{\text{TP}}{\text{TP} + \text{FN}} + \frac{\text{TN}}{\text{TN} + \text{FP}}\right)$$</w:t>
+      </w:r>
+    </w:p>
+    <w:p>
+      <w:pPr>
+        <w:pStyle w:val="ListNumber"/>
+        <w:spacing w:after="40"/>
+      </w:pPr>
+      <w:r>
+        <w:t>Precision (Positive Predictive Value):</w:t>
+      </w:r>
+    </w:p>
+    <w:p>
+      <w:pPr>
+        <w:spacing w:after="80" w:line="276" w:lineRule="auto"/>
+      </w:pPr>
+      <w:r>
+        <w:t>$$\text{Precision}_c = \frac{\text{True Positives}_c}{\text{True Positives}_c + \text{False Positives}_c}$$</w:t>
+      </w:r>
+    </w:p>
+    <w:p>
+      <w:pPr>
+        <w:pStyle w:val="ListNumber"/>
+        <w:spacing w:after="40"/>
+      </w:pPr>
+      <w:r>
+        <w:t>Recall / Sensitivity / True Positive Rate:</w:t>
+      </w:r>
+    </w:p>
+    <w:p>
+      <w:pPr>
+        <w:spacing w:after="80" w:line="276" w:lineRule="auto"/>
+      </w:pPr>
+      <w:r>
+        <w:t>$$\text{Recall}_1 = \frac{\text{TP}}{\text{TP} + \text{FN}}$$</w:t>
+      </w:r>
+    </w:p>
+    <w:p>
+      <w:pPr>
+        <w:pStyle w:val="ListNumber"/>
+        <w:spacing w:after="40"/>
+      </w:pPr>
+      <w:r>
+        <w:t>Specificity / True Negative Rate:</w:t>
+      </w:r>
+    </w:p>
+    <w:p>
+      <w:pPr>
+        <w:spacing w:after="80" w:line="276" w:lineRule="auto"/>
+      </w:pPr>
+      <w:r>
+        <w:t>$$\text{Specificity} = \text{Recall}_0 = \frac{\text{TN}}{\text{TN} + \text{FP}}$$</w:t>
+      </w:r>
+    </w:p>
+    <w:p>
+      <w:pPr>
+        <w:pStyle w:val="ListNumber"/>
+        <w:spacing w:after="40"/>
+      </w:pPr>
+      <w:r>
+        <w:t>Macro-Averaged F1-Score:</w:t>
+      </w:r>
+    </w:p>
+    <w:p>
+      <w:pPr>
+        <w:spacing w:after="80" w:line="276" w:lineRule="auto"/>
+      </w:pPr>
+      <w:r>
+        <w:t>$$F_{1, \text{macro}} = \frac{F_{1, \text{Class } 0} + F_{1, \text{Class } 1}}{2}, \quad \text{where } F_1 = 2 \times \frac{\text{Precision} \times \text{Recall}}{\text{Precision} + \text{Recall}}$$</w:t>
+      </w:r>
+    </w:p>
+    <w:p>
+      <w:pPr>
+        <w:spacing w:after="80" w:line="276" w:lineRule="auto"/>
+      </w:pPr>
+      <w:r>
+        <w:t>---</w:t>
+      </w:r>
+    </w:p>
+    <w:p>
+      <w:pPr>
+        <w:pStyle w:val="Heading3"/>
+        <w:spacing w:before="160" w:after="60"/>
+      </w:pPr>
+      <w:r>
+        <w:t>F.3 Confusion Matrix Visual Breakdown</w:t>
       </w:r>
     </w:p>
     <w:p/>
@@ -5483,7 +8584,7 @@
         <w:spacing w:before="160" w:after="60"/>
       </w:pPr>
       <w:r>
-        <w:t>F.3 ROC Curves and Discriminative Capacity</w:t>
+        <w:t>F.4 ROC Curves and Discriminative Capacity</w:t>
       </w:r>
     </w:p>
     <w:p/>
@@ -5598,7 +8699,7 @@
         <w:spacing w:before="160" w:after="60"/>
       </w:pPr>
       <w:r>
-        <w:t>F.4 Feature Importance Analysis</w:t>
+        <w:t>F.5 Feature Importance Analysis</w:t>
       </w:r>
     </w:p>
     <w:p/>
@@ -5722,7 +8823,7 @@
         <w:spacing w:before="160" w:after="60"/>
       </w:pPr>
       <w:r>
-        <w:t>F.5 Detailed Error Analysis</w:t>
+        <w:t>F.6 Detailed Error Analysis</w:t>
       </w:r>
     </w:p>
     <w:p>
@@ -5835,7 +8936,7 @@
         <w:spacing w:before="160" w:after="60"/>
       </w:pPr>
       <w:r>
-        <w:t>F.6 Project Limitations &amp; Recommendations</w:t>
+        <w:t>F.7 Project Limitations &amp; Recommendations</w:t>
       </w:r>
     </w:p>
     <w:p>
@@ -5863,6 +8964,15 @@
       </w:pPr>
       <w:r>
         <w:t>Exogenous Factors: The model currently lacks data on local events, marathon road closures, subway disruptions, and municipal holidays beyond official national dates. Integrating real-time municipal transit feeds would eliminate the small fraction of false-positive anomalies.</w:t>
+      </w:r>
+    </w:p>
+    <w:p>
+      <w:pPr>
+        <w:pStyle w:val="ListBullet"/>
+        <w:spacing w:after="40"/>
+      </w:pPr>
+      <w:r>
+        <w:t>Notebook Reference: *[Refer to Notebook Cells 16–22 for Test Evaluation, Confusion Matrices, ROC Curves, Feature Importance, and Error Analysis Code]*</w:t>
       </w:r>
     </w:p>
     <w:p>
@@ -6024,7 +9134,7 @@
               <w:rPr>
                 <w:sz w:val="18"/>
               </w:rPr>
-              <w:t>Clear objective, binary supervised task, APA citation, target formulation, and full data dictionary table.</w:t>
+              <w:t>Clear objective, binary supervised task, APA &amp; Google Drive citations, target encoding, and full data dictionary table.</w:t>
             </w:r>
           </w:p>
         </w:tc>
@@ -6041,7 +9151,7 @@
               <w:rPr>
                 <w:sz w:val="18"/>
               </w:rPr>
-              <w:t>Section A.1–A.4, Section B.1</w:t>
+              <w:t>Section A.1–A.4, Section B.1, `notebooks/final_project.ipynb` (Cells 1, 2, 5)</w:t>
             </w:r>
           </w:p>
         </w:tc>
@@ -6091,7 +9201,7 @@
               <w:rPr>
                 <w:sz w:val="18"/>
               </w:rPr>
-              <w:t>Traceable cleaning log, 0 null checks, 0 duplicate checks, column normalization, and explicit 100% data leakage remediation (`functioning_day` dropped).</w:t>
+              <w:t>Traceable cleaning log with before-and-after checks, programmatic outputs after each step, 0 nulls, 0 duplicates, column normalization, and explicit 100% data leakage remediation (`functioning_day` dropped).</w:t>
             </w:r>
           </w:p>
         </w:tc>
@@ -6107,7 +9217,7 @@
               <w:rPr>
                 <w:sz w:val="18"/>
               </w:rPr>
-              <w:t>Section B.2, `run_pipeline.py` (L55–L130)</w:t>
+              <w:t>Section B.2, `run_pipeline.py` (L55–L130), `notebooks/final_project.ipynb` (Cells 6–8)</w:t>
             </w:r>
           </w:p>
         </w:tc>
@@ -6160,7 +9270,7 @@
               <w:rPr>
                 <w:sz w:val="18"/>
               </w:rPr>
-              <w:t>4 labelled figures (Target balance, Diurnal/Seasonal lineplot, Weather boxplots, Correlation heatmap) with 4 detailed evidence-based interpretations.</w:t>
+              <w:t>4 labelled figures (Target balance, Diurnal/Seasonal lineplot, Weather boxplots, Correlation heatmap) with correct summary statistics table and 4 detailed evidence-based interpretations.</w:t>
             </w:r>
           </w:p>
         </w:tc>
@@ -6177,7 +9287,7 @@
               <w:rPr>
                 <w:sz w:val="18"/>
               </w:rPr>
-              <w:t>Section B.3, Figures 1–4</w:t>
+              <w:t>Section B.3, Section B.4, Figures 1–4, `notebooks/final_project.ipynb` (Cells 9–10)</w:t>
             </w:r>
           </w:p>
         </w:tc>
@@ -6227,7 +9337,7 @@
               <w:rPr>
                 <w:sz w:val="18"/>
               </w:rPr>
-              <w:t>Clean $X$ and $y$, reproducible 80–20 stratified split (`random_state=42`), and `ColumnTransformer` fitted strictly on `X_train`.</w:t>
+              <w:t>Clean $X$ and $y$, correlation-based selection table, reproducible 80–20 stratified split (`random_state=42`), and `ColumnTransformer` fitted strictly on `X_train`.</w:t>
             </w:r>
           </w:p>
         </w:tc>
@@ -6243,7 +9353,7 @@
               <w:rPr>
                 <w:sz w:val="18"/>
               </w:rPr>
-              <w:t>Section C, Section D, `run_pipeline.py` (L235–L285)</w:t>
+              <w:t>Section C, Section D, `run_pipeline.py` (L235–L285), `notebooks/final_project.ipynb` (Cells 11–13)</w:t>
             </w:r>
           </w:p>
         </w:tc>
@@ -6313,7 +9423,7 @@
               <w:rPr>
                 <w:sz w:val="18"/>
               </w:rPr>
-              <w:t>Section E, `notebooks/final_project.ipynb`</w:t>
+              <w:t>Section E, `notebooks/final_project.ipynb` (Cells 14–15)</w:t>
             </w:r>
           </w:p>
         </w:tc>
@@ -6363,7 +9473,7 @@
               <w:rPr>
                 <w:sz w:val="18"/>
               </w:rPr>
-              <w:t>Full test metrics (Confusion matrix, TN/FP/FN/TP, Bal Acc, Specificity, Sensitivity, F1, ROC-AUC), labelled CM/ROC plots, deep error analysis, and sensible limitations.</w:t>
+              <w:t>Full test metrics (Confusion matrix, TN/FP/FN/TP, Bal Acc, Specificity, Sensitivity, F1, ROC-AUC), metric formulas, labelled CM/ROC plots, deep error analysis, and sensible limitations.</w:t>
             </w:r>
           </w:p>
         </w:tc>
@@ -6379,7 +9489,7 @@
               <w:rPr>
                 <w:sz w:val="18"/>
               </w:rPr>
-              <w:t>Section F.1–F.6, Figures 5–7</w:t>
+              <w:t>Section F.1–F.7, Figures 5–7, `notebooks/final_project.ipynb` (Cells 16–22)</w:t>
             </w:r>
           </w:p>
         </w:tc>
@@ -6432,7 +9542,7 @@
               <w:rPr>
                 <w:sz w:val="18"/>
               </w:rPr>
-              <w:t>Structured Sections A through F, thorough explanations of all decisions, actual empirical numbers, and direct references to notebook evidence.</w:t>
+              <w:t>Structured Sections A through F, thorough explanations of all decisions, actual empirical numbers, citations, and clear links to notebook evidence.</w:t>
             </w:r>
           </w:p>
         </w:tc>
@@ -6449,7 +9559,7 @@
               <w:rPr>
                 <w:sz w:val="18"/>
               </w:rPr>
-              <w:t>`reports/FINAL_PROJECT_DOCUMENTATION.md`</w:t>
+              <w:t>`reports/FINAL_PROJECT_DOCUMENTATION.md` &amp; `.docx`</w:t>
             </w:r>
           </w:p>
         </w:tc>
@@ -6536,6 +9646,14 @@
       </w:pPr>
       <w:r>
         <w:t>*Prepared for De La Salle Lipa — College of Information Technology and Engineering — Intdsci Final Project.*</w:t>
+      </w:r>
+    </w:p>
+    <w:p>
+      <w:pPr>
+        <w:spacing w:after="80" w:line="276" w:lineRule="auto"/>
+      </w:pPr>
+      <w:r>
+        <w:t>*Section C2B | Instructor: Ms. Donna Garcia | Group FML: Fabello, Courtney Judge; Lubi, Axellerosh; Macaraig, Paolo Adrian | Date of Submission: Friday (October 30, 2026)*</w:t>
       </w:r>
     </w:p>
     <w:sectPr>

</xml_diff>